<commit_message>
Inclui na Aula 7 a extração da heap 8 6 7 1 3 4 2, um índice de cada vez.
Co-authored-by: Cursor <cursoragent@cursor.com>
</commit_message>
<xml_diff>
--- a/apostila/Apostila-Estruturas-de-Dados.docx
+++ b/apostila/Apostila-Estruturas-de-Dados.docx
@@ -2866,6 +2866,45 @@
         <w:spacing w:after="20" w:line="269" w:lineRule="auto"/>
         <w:ind w:left="312"/>
       </w:pPr>
+      <w:hyperlink w:anchor="s_extrair_a_raiz_um_de_cada_vez" w:history="1">
+        <w:r>
+          <w:rPr>
+            <w:color w:val="1A6B64"/>
+            <w:sz w:val="21"/>
+          </w:rPr>
+          <w:t>Extrair a raiz, um de cada vez</w:t>
+        </w:r>
+      </w:hyperlink>
+      <w:r>
+        <w:tab/>
+      </w:r>
+      <w:r>
+        <w:fldChar w:fldCharType="begin"/>
+      </w:r>
+      <w:r>
+        <w:instrText xml:space="preserve"> PAGEREF s_extrair_a_raiz_um_de_cada_vez \h </w:instrText>
+      </w:r>
+      <w:r>
+        <w:fldChar w:fldCharType="separate"/>
+      </w:r>
+      <w:r>
+        <w:rPr>
+          <w:noProof/>
+        </w:rPr>
+        <w:t>45</w:t>
+      </w:r>
+      <w:r>
+        <w:fldChar w:fldCharType="end"/>
+      </w:r>
+    </w:p>
+    <w:p>
+      <w:pPr>
+        <w:tabs>
+          <w:tab w:val="right" w:leader="dot" w:pos="9600"/>
+        </w:tabs>
+        <w:spacing w:after="20" w:line="269" w:lineRule="auto"/>
+        <w:ind w:left="312"/>
+      </w:pPr>
       <w:hyperlink w:anchor="s_briefing_do_projeto_final" w:history="1">
         <w:r>
           <w:rPr>
@@ -2882,7 +2921,10 @@
         <w:fldChar w:fldCharType="begin"/>
       </w:r>
       <w:r>
-        <w:instrText xml:space="preserve"> PAGEREF s_briefing_do_projeto_final \h </w:instrText>
+        <w:instrText xml:space="preserve"> PAGER</w:instrText>
+      </w:r>
+      <w:r>
+        <w:instrText xml:space="preserve">EF s_briefing_do_projeto_final \h </w:instrText>
       </w:r>
       <w:r>
         <w:fldChar w:fldCharType="separate"/>
@@ -2891,7 +2933,7 @@
         <w:rPr>
           <w:noProof/>
         </w:rPr>
-        <w:t>45</w:t>
+        <w:t>47</w:t>
       </w:r>
       <w:r>
         <w:fldChar w:fldCharType="end"/>
@@ -2936,10 +2978,7 @@
         <w:fldChar w:fldCharType="begin"/>
       </w:r>
       <w:r>
-        <w:instrText xml:space="preserve"> P</w:instrText>
-      </w:r>
-      <w:r>
-        <w:instrText xml:space="preserve">AGEREF s_aula_8_projeto_final_pbl_integrado \h </w:instrText>
+        <w:instrText xml:space="preserve"> PAGEREF s_aula_8_projeto_final_pbl_integrado \h </w:instrText>
       </w:r>
       <w:r>
         <w:fldChar w:fldCharType="separate"/>
@@ -2948,7 +2987,7 @@
         <w:rPr>
           <w:noProof/>
         </w:rPr>
-        <w:t>47</w:t>
+        <w:t>48</w:t>
       </w:r>
       <w:r>
         <w:fldChar w:fldCharType="end"/>
@@ -2987,7 +3026,7 @@
         <w:rPr>
           <w:noProof/>
         </w:rPr>
-        <w:t>47</w:t>
+        <w:t>48</w:t>
       </w:r>
       <w:r>
         <w:fldChar w:fldCharType="end"/>
@@ -3026,7 +3065,7 @@
         <w:rPr>
           <w:noProof/>
         </w:rPr>
-        <w:t>48</w:t>
+        <w:t>49</w:t>
       </w:r>
       <w:r>
         <w:fldChar w:fldCharType="end"/>
@@ -3065,7 +3104,7 @@
         <w:rPr>
           <w:noProof/>
         </w:rPr>
-        <w:t>48</w:t>
+        <w:t>49</w:t>
       </w:r>
       <w:r>
         <w:fldChar w:fldCharType="end"/>
@@ -3104,7 +3143,7 @@
         <w:rPr>
           <w:noProof/>
         </w:rPr>
-        <w:t>49</w:t>
+        <w:t>50</w:t>
       </w:r>
       <w:r>
         <w:fldChar w:fldCharType="end"/>
@@ -3158,7 +3197,7 @@
         <w:rPr>
           <w:noProof/>
         </w:rPr>
-        <w:t>50</w:t>
+        <w:t>51</w:t>
       </w:r>
       <w:r>
         <w:fldChar w:fldCharType="end"/>
@@ -3197,7 +3236,7 @@
         <w:rPr>
           <w:noProof/>
         </w:rPr>
-        <w:t>50</w:t>
+        <w:t>51</w:t>
       </w:r>
       <w:r>
         <w:fldChar w:fldCharType="end"/>
@@ -3242,10 +3281,7 @@
         <w:fldChar w:fldCharType="begin"/>
       </w:r>
       <w:r>
-        <w:instrText xml:space="preserve"> PAGEREF s_apen</w:instrText>
-      </w:r>
-      <w:r>
-        <w:instrText xml:space="preserve">dice_glossario_de_funcoes \h </w:instrText>
+        <w:instrText xml:space="preserve"> PAGEREF s_apendice_glossario_de_funcoes \h </w:instrText>
       </w:r>
       <w:r>
         <w:fldChar w:fldCharType="separate"/>
@@ -3254,7 +3290,7 @@
         <w:rPr>
           <w:noProof/>
         </w:rPr>
-        <w:t>52</w:t>
+        <w:t>53</w:t>
       </w:r>
       <w:r>
         <w:fldChar w:fldCharType="end"/>
@@ -3293,7 +3329,7 @@
         <w:rPr>
           <w:noProof/>
         </w:rPr>
-        <w:t>52</w:t>
+        <w:t>53</w:t>
       </w:r>
       <w:r>
         <w:fldChar w:fldCharType="end"/>
@@ -3330,7 +3366,13 @@
         <w:rPr>
           <w:rFonts w:eastAsia="Calibri"/>
         </w:rPr>
-        <w:t>Esta apostila acompanha o curso Estruturas de Dados. Cada aula tem 2h30. Você lê a explicação, copia o código com o professor e faz a prática no fim.</w:t>
+        <w:t>Esta a</w:t>
+      </w:r>
+      <w:r>
+        <w:rPr>
+          <w:rFonts w:eastAsia="Calibri"/>
+        </w:rPr>
+        <w:t>postila acompanha o curso Estruturas de Dados. Cada aula tem 2h30. Você lê a explicação, copia o código com o professor e faz a prática no fim.</w:t>
       </w:r>
     </w:p>
     <w:p>
@@ -3338,13 +3380,13 @@
         <w:rPr>
           <w:rFonts w:eastAsia="Calibri"/>
         </w:rPr>
-        <w:t xml:space="preserve">Usamos o VS Code do </w:t>
-      </w:r>
-      <w:r>
-        <w:rPr>
-          <w:rFonts w:eastAsia="Calibri"/>
-        </w:rPr>
-        <w:t>primeiro ao último encontro. A instalação é em casa — não consome tempo de aula. O projeto do curso é um simulador de logística: cada estrutura vira uma peça, e a Aula 8 junta o sistema.</w:t>
+        <w:t>Usamos o VS Code do primeiro ao último encontro. A instalação é em casa — não consome tempo de aula. O projeto d</w:t>
+      </w:r>
+      <w:r>
+        <w:rPr>
+          <w:rFonts w:eastAsia="Calibri"/>
+        </w:rPr>
+        <w:t>o curso é um simulador de logística: cada estrutura vira uma peça, e a Aula 8 junta o sistema.</w:t>
       </w:r>
     </w:p>
     <w:p>
@@ -3369,13 +3411,7 @@
         <w:rPr>
           <w:rFonts w:eastAsia="Calibri"/>
         </w:rPr>
-        <w:t>Não é um script copiado da internet: você co</w:t>
-      </w:r>
-      <w:r>
-        <w:rPr>
-          <w:rFonts w:eastAsia="Calibri"/>
-        </w:rPr>
-        <w:t>nstrói em camadas. Uma peça por vez, conferida no checkpoint do fim da aula.</w:t>
+        <w:t>Não é um script copiado da internet: você constrói em camadas. Uma peça por vez, conferida no checkpoint do fim da aula.</w:t>
       </w:r>
     </w:p>
     <w:p>
@@ -3405,7 +3441,13 @@
         <w:rPr>
           <w:rFonts w:eastAsia="Calibri"/>
         </w:rPr>
-        <w:t>Aulas 1 e 2 — memória contígua (array) e memória ligada (lista encadeada).</w:t>
+        <w:t xml:space="preserve">Aulas 1 e 2 </w:t>
+      </w:r>
+      <w:r>
+        <w:rPr>
+          <w:rFonts w:eastAsia="Calibri"/>
+        </w:rPr>
+        <w:t>— memória contígua (array) e memória ligada (lista encadeada).</w:t>
       </w:r>
     </w:p>
     <w:p>
@@ -3465,13 +3507,7 @@
         <w:rPr>
           <w:rFonts w:eastAsia="Calibri"/>
         </w:rPr>
-        <w:t xml:space="preserve">Aulas 6 e 7 </w:t>
-      </w:r>
-      <w:r>
-        <w:rPr>
-          <w:rFonts w:eastAsia="Calibri"/>
-        </w:rPr>
-        <w:t>— relações (grafo + BFS) e prioridade (heap).</w:t>
+        <w:t>Aulas 6 e 7 — relações (grafo + BFS) e prioridade (heap).</w:t>
       </w:r>
     </w:p>
     <w:p>
@@ -3501,7 +3537,13 @@
         <w:rPr>
           <w:rFonts w:eastAsia="Calibri"/>
         </w:rPr>
-        <w:t>Aula 8 — simulador de logística, README e apresentação.</w:t>
+        <w:t xml:space="preserve">Aula 8 — simulador de logística, README e </w:t>
+      </w:r>
+      <w:r>
+        <w:rPr>
+          <w:rFonts w:eastAsia="Calibri"/>
+        </w:rPr>
+        <w:t>apresentação.</w:t>
       </w:r>
     </w:p>
     <w:tbl>
@@ -3691,13 +3733,13 @@
         <w:rPr>
           <w:rFonts w:eastAsia="Calibri"/>
         </w:rPr>
-        <w:t xml:space="preserve">Python 3 e VS Code. O passo a passo está no capítulo </w:t>
-      </w:r>
-      <w:r>
-        <w:rPr>
-          <w:rFonts w:eastAsia="Calibri"/>
-        </w:rPr>
-        <w:t>Instalação — fazer em casa. Se a tela falhar, use Se deu erro, faça isto.</w:t>
+        <w:t xml:space="preserve">Python 3 e VS Code. O passo a passo está no capítulo Instalação — </w:t>
+      </w:r>
+      <w:r>
+        <w:rPr>
+          <w:rFonts w:eastAsia="Calibri"/>
+        </w:rPr>
+        <w:t>fazer em casa. Se a tela falhar, use Se deu erro, faça isto.</w:t>
       </w:r>
     </w:p>
     <w:p>
@@ -3761,13 +3803,13 @@
         <w:rPr>
           <w:rFonts w:eastAsia="Calibri"/>
         </w:rPr>
-        <w:t xml:space="preserve">, e escrever uma classe simples. Lista e dicionário nativos </w:t>
-      </w:r>
-      <w:r>
-        <w:rPr>
-          <w:rFonts w:eastAsia="Calibri"/>
-        </w:rPr>
-        <w:t>aparecem só como contraste com a estrutura real. Funções pontuais (</w:t>
+        <w:t>, e escrever uma classe simples. Lista e dicionário nativos aparecem só como</w:t>
+      </w:r>
+      <w:r>
+        <w:rPr>
+          <w:rFonts w:eastAsia="Calibri"/>
+        </w:rPr>
+        <w:t xml:space="preserve"> contraste com a estrutura real. Funções pontuais (</w:t>
       </w:r>
       <w:r>
         <w:rPr>
@@ -3885,13 +3927,13 @@
         <w:rPr>
           <w:rFonts w:eastAsia="Calibri"/>
         </w:rPr>
-        <w:t>Au</w:t>
-      </w:r>
-      <w:r>
-        <w:rPr>
-          <w:rFonts w:eastAsia="Calibri"/>
-        </w:rPr>
-        <w:t>la 2 — Listas Encadeadas (Linked Lists)</w:t>
+        <w:t>Aula 2 — Listas En</w:t>
+      </w:r>
+      <w:r>
+        <w:rPr>
+          <w:rFonts w:eastAsia="Calibri"/>
+        </w:rPr>
+        <w:t>cadeadas (Linked Lists)</w:t>
       </w:r>
     </w:p>
     <w:p>
@@ -4042,13 +4084,13 @@
         <w:rPr>
           <w:rFonts w:eastAsia="Calibri"/>
         </w:rPr>
-        <w:t>Aula 7 — Estruturas avan</w:t>
-      </w:r>
-      <w:r>
-        <w:rPr>
-          <w:rFonts w:eastAsia="Calibri"/>
-        </w:rPr>
-        <w:t>çadas (Heaps) e preparação para o projeto</w:t>
+        <w:t xml:space="preserve">Aula 7 — Estruturas avançadas (Heaps) e </w:t>
+      </w:r>
+      <w:r>
+        <w:rPr>
+          <w:rFonts w:eastAsia="Calibri"/>
+        </w:rPr>
+        <w:t>preparação para o projeto</w:t>
       </w:r>
     </w:p>
     <w:p>
@@ -4189,7 +4231,14 @@
                 <w:rFonts w:eastAsia="Calibri"/>
                 <w:sz w:val="22"/>
               </w:rPr>
-              <w:t xml:space="preserve"> é aula. Nas 8 aulas o professor considera Python e VS Code já instalados. Use estas páginas em casa, antes do curso ou se o computador for novo.</w:t>
+              <w:t xml:space="preserve"> é aula. Nas 8 aulas o professor considera Python e VS Code já instalados. Use estas páginas em casa, antes do curso</w:t>
+            </w:r>
+            <w:r>
+              <w:rPr>
+                <w:rFonts w:eastAsia="Calibri"/>
+                <w:sz w:val="22"/>
+              </w:rPr>
+              <w:t xml:space="preserve"> ou se o computador for novo.</w:t>
             </w:r>
           </w:p>
         </w:tc>
@@ -4255,14 +4304,7 @@
           <w:rFonts w:eastAsia="Calibri"/>
           <w:i/>
         </w:rPr>
-        <w:t xml:space="preserve">Add </w:t>
-      </w:r>
-      <w:r>
-        <w:rPr>
-          <w:rFonts w:eastAsia="Calibri"/>
-          <w:i/>
-        </w:rPr>
-        <w:t>python.exe to PATH</w:t>
+        <w:t>Add python.exe to PATH</w:t>
       </w:r>
       <w:r>
         <w:rPr>
@@ -4295,7 +4337,15 @@
           <w:color w:val="1A6B64"/>
           <w:sz w:val="22"/>
         </w:rPr>
-        <w:t>python --version</w:t>
+        <w:t xml:space="preserve">python </w:t>
+      </w:r>
+      <w:r>
+        <w:rPr>
+          <w:rFonts w:ascii="Consolas" w:eastAsia="Consolas" w:hAnsi="Consolas"/>
+          <w:color w:val="1A6B64"/>
+          <w:sz w:val="22"/>
+        </w:rPr>
+        <w:t>--version</w:t>
       </w:r>
       <w:r>
         <w:rPr>
@@ -4356,13 +4406,7 @@
         <w:rPr>
           <w:rFonts w:eastAsia="Calibri"/>
         </w:rPr>
-        <w:t>Abra o VS Code → ícone de extensões → i</w:t>
-      </w:r>
-      <w:r>
-        <w:rPr>
-          <w:rFonts w:eastAsia="Calibri"/>
-        </w:rPr>
-        <w:t xml:space="preserve">nstale a extensão </w:t>
+        <w:t xml:space="preserve">Abra o VS Code → ícone de extensões → instale a extensão </w:t>
       </w:r>
       <w:r>
         <w:rPr>
@@ -4542,7 +4586,16 @@
           <w:color w:val="1A6B64"/>
           <w:sz w:val="30"/>
         </w:rPr>
-        <w:t>Conferir se está pronto</w:t>
+        <w:t xml:space="preserve">Conferir </w:t>
+      </w:r>
+      <w:r>
+        <w:rPr>
+          <w:rFonts w:ascii="Trebuchet MS" w:eastAsia="Trebuchet MS" w:hAnsi="Trebuchet MS"/>
+          <w:b/>
+          <w:color w:val="1A6B64"/>
+          <w:sz w:val="30"/>
+        </w:rPr>
+        <w:t>se está pronto</w:t>
       </w:r>
       <w:bookmarkEnd w:id="8"/>
     </w:p>
@@ -4683,13 +4736,7 @@
         <w:rPr>
           <w:rFonts w:eastAsia="Calibri"/>
         </w:rPr>
-        <w:t>, comando não encontrado</w:t>
-      </w:r>
-      <w:r>
-        <w:rPr>
-          <w:rFonts w:eastAsia="Calibri"/>
-        </w:rPr>
-        <w:t xml:space="preserve"> ou o VS Code pede para escolher um interpretador e a lista vem vazia.</w:t>
+        <w:t>, comando não encontrado ou o VS Code pede para escolher um interpretador e a lista vem vazia.</w:t>
       </w:r>
     </w:p>
     <w:p>
@@ -4719,7 +4766,13 @@
         <w:rPr>
           <w:rFonts w:eastAsia="Calibri"/>
         </w:rPr>
-        <w:t xml:space="preserve">O Python não está instalado, ou foi instalado </w:t>
+        <w:t>O Python não está instalado, ou foi i</w:t>
+      </w:r>
+      <w:r>
+        <w:rPr>
+          <w:rFonts w:eastAsia="Calibri"/>
+        </w:rPr>
+        <w:t xml:space="preserve">nstalado </w:t>
       </w:r>
       <w:r>
         <w:rPr>
@@ -4805,13 +4858,7 @@
         <w:rPr>
           <w:rFonts w:eastAsia="Calibri"/>
         </w:rPr>
-        <w:t>No VS Code: C</w:t>
-      </w:r>
-      <w:r>
-        <w:rPr>
-          <w:rFonts w:eastAsia="Calibri"/>
-        </w:rPr>
-        <w:t xml:space="preserve">trl+Shift+P → </w:t>
+        <w:t xml:space="preserve">No VS Code: Ctrl+Shift+P → </w:t>
       </w:r>
       <w:r>
         <w:rPr>
@@ -4902,10 +4949,7 @@
         <w:fldChar w:fldCharType="begin"/>
       </w:r>
       <w:r>
-        <w:instrText xml:space="preserve"> PAGEREF s_instalaca</w:instrText>
-      </w:r>
-      <w:r>
-        <w:instrText xml:space="preserve">o_fazer_em_casa_nao_en_38f464 \h </w:instrText>
+        <w:instrText xml:space="preserve"> PAGEREF s_instalacao_fazer_em_casa_nao_en_38f464 \h </w:instrText>
       </w:r>
       <w:r>
         <w:fldChar w:fldCharType="separate"/>
@@ -5036,7 +5080,13 @@
         <w:rPr>
           <w:rFonts w:eastAsia="Calibri"/>
         </w:rPr>
-        <w:t>Tudo que pertence ao if/for/def deve ficar 4 espaços mais à direita.</w:t>
+        <w:t xml:space="preserve">Tudo </w:t>
+      </w:r>
+      <w:r>
+        <w:rPr>
+          <w:rFonts w:eastAsia="Calibri"/>
+        </w:rPr>
+        <w:t>que pertence ao if/for/def deve ficar 4 espaços mais à direita.</w:t>
       </w:r>
     </w:p>
     <w:p>
@@ -5096,13 +5146,7 @@
         <w:rPr>
           <w:rFonts w:eastAsia="Calibri"/>
         </w:rPr>
-        <w:t xml:space="preserve">Se copiou código do </w:t>
-      </w:r>
-      <w:r>
-        <w:rPr>
-          <w:rFonts w:eastAsia="Calibri"/>
-        </w:rPr>
-        <w:t>WhatsApp, cole no editor e realinhe as linhas.</w:t>
+        <w:t>Se copiou código do WhatsApp, cole no editor e realinhe as linhas.</w:t>
       </w:r>
     </w:p>
     <w:p>
@@ -5146,7 +5190,13 @@
         <w:rPr>
           <w:rFonts w:eastAsia="Calibri"/>
         </w:rPr>
-        <w:t xml:space="preserve"> sempre precisa estar mais para dentro.</w:t>
+        <w:t xml:space="preserve"> sempre precisa estar m</w:t>
+      </w:r>
+      <w:r>
+        <w:rPr>
+          <w:rFonts w:eastAsia="Calibri"/>
+        </w:rPr>
+        <w:t>ais para dentro.</w:t>
       </w:r>
     </w:p>
     <w:p>
@@ -5229,13 +5279,7 @@
         <w:rPr>
           <w:rFonts w:eastAsia="Calibri"/>
         </w:rPr>
-        <w:t>O terminal tem que estar na pasta do projeto (aque</w:t>
-      </w:r>
-      <w:r>
-        <w:rPr>
-          <w:rFonts w:eastAsia="Calibri"/>
-        </w:rPr>
-        <w:t xml:space="preserve">la que contém </w:t>
+        <w:t xml:space="preserve">O terminal tem que estar na pasta do projeto (aquela que contém </w:t>
       </w:r>
       <w:r>
         <w:rPr>
@@ -5279,7 +5323,13 @@
         <w:rPr>
           <w:rFonts w:eastAsia="Calibri"/>
         </w:rPr>
-        <w:t>No VS Code: File → Open Folder nessa pasta, depois Terminal → New Terminal.</w:t>
+        <w:t>No VS Code: File → Open Folder nessa pasta, depois Terminal → New Te</w:t>
+      </w:r>
+      <w:r>
+        <w:rPr>
+          <w:rFonts w:eastAsia="Calibri"/>
+        </w:rPr>
+        <w:t>rminal.</w:t>
       </w:r>
     </w:p>
     <w:p>
@@ -5356,15 +5406,7 @@
           <w:color w:val="1A6B64"/>
           <w:sz w:val="22"/>
         </w:rPr>
-        <w:t>'NoneType' object has no attribute 'p</w:t>
-      </w:r>
-      <w:r>
-        <w:rPr>
-          <w:rFonts w:ascii="Consolas" w:eastAsia="Consolas" w:hAnsi="Consolas"/>
-          <w:color w:val="1A6B64"/>
-          <w:sz w:val="22"/>
-        </w:rPr>
-        <w:t>roximo'</w:t>
+        <w:t>'NoneType' object has no attribute 'proximo'</w:t>
       </w:r>
       <w:r>
         <w:rPr>
@@ -5544,13 +5586,7 @@
         <w:rPr>
           <w:rFonts w:eastAsia="Calibri"/>
         </w:rPr>
-        <w:t>Esse erro é o equivalente ao NullPointerException de outras ling</w:t>
-      </w:r>
-      <w:r>
-        <w:rPr>
-          <w:rFonts w:eastAsia="Calibri"/>
-        </w:rPr>
-        <w:t>uagens.</w:t>
+        <w:t>Esse erro é o equivalente ao NullPointerException de outras linguagens.</w:t>
       </w:r>
     </w:p>
     <w:p>
@@ -5584,7 +5620,13 @@
         <w:rPr>
           <w:rFonts w:eastAsia="Calibri"/>
         </w:rPr>
-        <w:t>Código não é só para o computador. Daqui a uma semana você vai reler o que escreveu hoje. O professor também. Por isso esta apostila cobra hábito, não só o programa que “funciona”.</w:t>
+        <w:t>Código não é só para o computador. Daqui a uma semana v</w:t>
+      </w:r>
+      <w:r>
+        <w:rPr>
+          <w:rFonts w:eastAsia="Calibri"/>
+        </w:rPr>
+        <w:t>ocê vai reler o que escreveu hoje. O professor também. Por isso esta apostila cobra hábito, não só o programa que “funciona”.</w:t>
       </w:r>
     </w:p>
     <w:p>
@@ -5845,13 +5887,7 @@
         <w:rPr>
           <w:rFonts w:eastAsia="Calibri"/>
         </w:rPr>
-        <w:t>Python usa 4 espaços. Uma linha, uma ideia. Não esprema inserção, ponteiro e</w:t>
-      </w:r>
-      <w:r>
-        <w:rPr>
-          <w:rFonts w:eastAsia="Calibri"/>
-        </w:rPr>
-        <w:t xml:space="preserve"> print na mesma linha.</w:t>
+        <w:t>Python usa 4 espaços. Uma linha, uma ideia. Não esprema inserção, ponteiro e print na mesma linha.</w:t>
       </w:r>
     </w:p>
     <w:p>
@@ -5929,13 +5965,13 @@
         <w:rPr>
           <w:rFonts w:eastAsia="Calibri"/>
         </w:rPr>
-        <w:t xml:space="preserve"> em quatro métodos é armadilha. Qu</w:t>
-      </w:r>
-      <w:r>
-        <w:rPr>
-          <w:rFonts w:eastAsia="Calibri"/>
-        </w:rPr>
-        <w:t>ando a lista muda, você corrige um e esquece os outros.</w:t>
+        <w:t xml:space="preserve"> em quatro métodos é armadilha. Quando a lista muda, você corrige um e e</w:t>
+      </w:r>
+      <w:r>
+        <w:rPr>
+          <w:rFonts w:eastAsia="Calibri"/>
+        </w:rPr>
+        <w:t>squece os outros.</w:t>
       </w:r>
     </w:p>
     <w:p>
@@ -6176,7 +6212,14 @@
                 <w:rFonts w:eastAsia="Calibri"/>
                 <w:sz w:val="22"/>
               </w:rPr>
-              <w:t>Colar uma BST da internet sem saber apontar a regra esquerda/direita é nota baixa. Se não consegue explicar em voz alta por que escolheu hash em vez de árvore, ainda não é seu código.</w:t>
+              <w:t xml:space="preserve">Colar uma BST da internet sem saber </w:t>
+            </w:r>
+            <w:r>
+              <w:rPr>
+                <w:rFonts w:eastAsia="Calibri"/>
+                <w:sz w:val="22"/>
+              </w:rPr>
+              <w:t>apontar a regra esquerda/direita é nota baixa. Se não consegue explicar em voz alta por que escolheu hash em vez de árvore, ainda não é seu código.</w:t>
             </w:r>
           </w:p>
         </w:tc>
@@ -6236,14 +6279,14 @@
                 <w:rFonts w:eastAsia="Calibri"/>
                 <w:sz w:val="22"/>
               </w:rPr>
-              <w:t xml:space="preserve">No projeto, o README pede exatamente isso: onde está cada </w:t>
+              <w:t xml:space="preserve">No projeto, o README pede exatamente isso: onde está cada estrutura. Quem escreveu com clareza </w:t>
             </w:r>
             <w:r>
               <w:rPr>
                 <w:rFonts w:eastAsia="Calibri"/>
                 <w:sz w:val="22"/>
               </w:rPr>
-              <w:t>estrutura. Quem escreveu com clareza preenche o README em dois minutos.</w:t>
+              <w:t>preenche o README em dois minutos.</w:t>
             </w:r>
           </w:p>
         </w:tc>
@@ -6368,13 +6411,7 @@
         <w:rPr>
           <w:rFonts w:eastAsia="Calibri"/>
         </w:rPr>
-        <w:t>Erro em vermelho: leia a última linha da m</w:t>
-      </w:r>
-      <w:r>
-        <w:rPr>
-          <w:rFonts w:eastAsia="Calibri"/>
-        </w:rPr>
-        <w:t>ensagem primeiro.</w:t>
+        <w:t>Erro em vermelho: leia a última linha da mensagem primeiro.</w:t>
       </w:r>
     </w:p>
     <w:p>
@@ -6404,7 +6441,13 @@
         <w:rPr>
           <w:rFonts w:eastAsia="Calibri"/>
         </w:rPr>
-        <w:t>Antes de apresentar: rode de novo do zero. O que não roda, não entrega.</w:t>
+        <w:t>Antes de apresen</w:t>
+      </w:r>
+      <w:r>
+        <w:rPr>
+          <w:rFonts w:eastAsia="Calibri"/>
+        </w:rPr>
+        <w:t>tar: rode de novo do zero. O que não roda, não entrega.</w:t>
       </w:r>
     </w:p>
     <w:p>
@@ -6500,14 +6543,14 @@
                 <w:rFonts w:eastAsia="Calibri"/>
                 <w:sz w:val="22"/>
               </w:rPr>
-              <w:t>Entender alocação contígua na RAM, ler Big-O no pior caso e simular um array estático em</w:t>
+              <w:t>Entender alocação contígua na RAM, ler Big-O no pior caso e simular um array estático em Python — inclusive o erro de capacid</w:t>
             </w:r>
             <w:r>
               <w:rPr>
                 <w:rFonts w:eastAsia="Calibri"/>
                 <w:sz w:val="22"/>
               </w:rPr>
-              <w:t xml:space="preserve"> Python — inclusive o erro de capacidade cheia.</w:t>
+              <w:t>ade cheia.</w:t>
             </w:r>
           </w:p>
         </w:tc>
@@ -6726,7 +6769,13 @@
         <w:rPr>
           <w:rFonts w:eastAsia="Calibri"/>
         </w:rPr>
-        <w:t xml:space="preserve"> clássico têm teto; passar disso é overflow — em linguagens de tamanho fixo. O Python mascara isso; a estrutura de dados, não.</w:t>
+        <w:t xml:space="preserve"> clássi</w:t>
+      </w:r>
+      <w:r>
+        <w:rPr>
+          <w:rFonts w:eastAsia="Calibri"/>
+        </w:rPr>
+        <w:t>co têm teto; passar disso é overflow — em linguagens de tamanho fixo. O Python mascara isso; a estrutura de dados, não.</w:t>
       </w:r>
     </w:p>
     <w:p>
@@ -6849,7 +6898,7 @@
           <w:sz w:val="18"/>
         </w:rPr>
         <w:lastRenderedPageBreak/>
-        <w:t xml:space="preserve">Faixas com e sem sinal. Na lousa, complete 8 e 16 bits com a </w:t>
+        <w:t xml:space="preserve">Faixas com e sem sinal. Na lousa, complete 8 e 16 bits com a turma </w:t>
       </w:r>
       <w:r>
         <w:rPr>
@@ -6858,7 +6907,7 @@
           <w:color w:val="5C5C5C"/>
           <w:sz w:val="18"/>
         </w:rPr>
-        <w:t>turma antes de mostrar a tabela.</w:t>
+        <w:t>antes de mostrar a tabela.</w:t>
       </w:r>
     </w:p>
     <w:p>
@@ -6927,13 +6976,13 @@
         <w:rPr>
           <w:rFonts w:eastAsia="Calibri"/>
         </w:rPr>
-        <w:t>Se precisar do 6º item, a próxima gaveta pode estar ocupada por outro programa. Aí o computador procura um bloco de 6, copia os 5 itens e</w:t>
-      </w:r>
-      <w:r>
-        <w:rPr>
-          <w:rFonts w:eastAsia="Calibri"/>
-        </w:rPr>
-        <w:t xml:space="preserve"> adiciona o novo. Essa cópia é o custo: tempo linear, </w:t>
+        <w:t>Se precisar do 6º item, a próxima gaveta pode estar ocupada por outro programa. Aí o computador procura um bloco de 6, copia os 5 itens e adici</w:t>
+      </w:r>
+      <w:r>
+        <w:rPr>
+          <w:rFonts w:eastAsia="Calibri"/>
+        </w:rPr>
+        <w:t xml:space="preserve">ona o novo. Essa cópia é o custo: tempo linear, </w:t>
       </w:r>
       <w:r>
         <w:rPr>
@@ -7094,14 +7143,14 @@
                 <w:rFonts w:eastAsia="Calibri"/>
                 <w:sz w:val="22"/>
               </w:rPr>
-              <w:t>) é um array dinâmico escrito em C. Ela mascara o redimensiona</w:t>
+              <w:t>) é um array dinâmico escrito em C. Ela mascara o redimensionamento.</w:t>
             </w:r>
             <w:r>
               <w:rPr>
                 <w:rFonts w:eastAsia="Calibri"/>
                 <w:sz w:val="22"/>
               </w:rPr>
-              <w:t>mento. Nesta aula você simula o array rígido para ver o limite.</w:t>
+              <w:t xml:space="preserve"> Nesta aula você simula o array rígido para ver o limite.</w:t>
             </w:r>
           </w:p>
         </w:tc>
@@ -7176,7 +7225,7 @@
           <w:color w:val="1A6B64"/>
           <w:sz w:val="22"/>
         </w:rPr>
-        <w:t>endereço_base + (índice *</w:t>
+        <w:t xml:space="preserve">endereço_base + (índice * </w:t>
       </w:r>
       <w:r>
         <w:rPr>
@@ -7184,7 +7233,7 @@
           <w:color w:val="1A6B64"/>
           <w:sz w:val="22"/>
         </w:rPr>
-        <w:t xml:space="preserve"> tamanho_do_dado)</w:t>
+        <w:t>tamanho_do_dado)</w:t>
       </w:r>
       <w:r>
         <w:rPr>
@@ -7328,7 +7377,7 @@
           <w:color w:val="5C5C5C"/>
           <w:sz w:val="18"/>
         </w:rPr>
-        <w:t xml:space="preserve">O eixo horizontal é o tamanho da entrada; o vertical é o trabalho. </w:t>
+        <w:t>O eixo horizontal é o tamanho da entrada; o vertical é o trabalho. O(1)</w:t>
       </w:r>
       <w:r>
         <w:rPr>
@@ -7337,7 +7386,7 @@
           <w:color w:val="5C5C5C"/>
           <w:sz w:val="18"/>
         </w:rPr>
-        <w:t>O(1) é a reta baixa; O(n²) dispara.</w:t>
+        <w:t xml:space="preserve"> é a reta baixa; O(n²) dispara.</w:t>
       </w:r>
     </w:p>
     <w:p>
@@ -7532,15 +7581,7 @@
                 <w:color w:val="D6DEE4"/>
                 <w:sz w:val="20"/>
               </w:rPr>
-              <w:t>, capacidad</w:t>
-            </w:r>
-            <w:r>
-              <w:rPr>
-                <w:rFonts w:ascii="Consolas" w:eastAsia="Consolas" w:hAnsi="Consolas"/>
-                <w:color w:val="D6DEE4"/>
-                <w:sz w:val="20"/>
-              </w:rPr>
-              <w:t>e):</w:t>
+              <w:t>, capacidade):</w:t>
             </w:r>
           </w:p>
           <w:p>
@@ -7868,7 +7909,15 @@
                 <w:color w:val="8FBF7F"/>
                 <w:sz w:val="20"/>
               </w:rPr>
-              <w:t>"Índice fora dos limites."</w:t>
+              <w:t>"Índic</w:t>
+            </w:r>
+            <w:r>
+              <w:rPr>
+                <w:rFonts w:ascii="Consolas" w:eastAsia="Consolas" w:hAnsi="Consolas"/>
+                <w:color w:val="8FBF7F"/>
+                <w:sz w:val="20"/>
+              </w:rPr>
+              <w:t>e fora dos limites."</w:t>
             </w:r>
             <w:r>
               <w:rPr>
@@ -8159,7 +8208,15 @@
                 <w:color w:val="8FBF7F"/>
                 <w:sz w:val="20"/>
               </w:rPr>
-              <w:t>"Array cheio."</w:t>
+              <w:t xml:space="preserve">"Array </w:t>
+            </w:r>
+            <w:r>
+              <w:rPr>
+                <w:rFonts w:ascii="Consolas" w:eastAsia="Consolas" w:hAnsi="Consolas"/>
+                <w:color w:val="8FBF7F"/>
+                <w:sz w:val="20"/>
+              </w:rPr>
+              <w:t>cheio."</w:t>
             </w:r>
             <w:r>
               <w:rPr>
@@ -8558,16 +8615,7 @@
                 <w:color w:val="0E2438"/>
                 <w:sz w:val="22"/>
               </w:rPr>
-              <w:t>Dic</w:t>
-            </w:r>
-            <w:r>
-              <w:rPr>
-                <w:rFonts w:ascii="Trebuchet MS" w:eastAsia="Trebuchet MS" w:hAnsi="Trebuchet MS"/>
-                <w:b/>
-                <w:color w:val="0E2438"/>
-                <w:sz w:val="22"/>
-              </w:rPr>
-              <w:t>a</w:t>
+              <w:t>Dica</w:t>
             </w:r>
           </w:p>
           <w:p>
@@ -8685,14 +8733,7 @@
                 <w:rFonts w:eastAsia="Calibri"/>
                 <w:sz w:val="22"/>
               </w:rPr>
-              <w:t xml:space="preserve">Sempre teste o limite: um array que nunca enche não ensina </w:t>
-            </w:r>
-            <w:r>
-              <w:rPr>
-                <w:rFonts w:eastAsia="Calibri"/>
-                <w:sz w:val="22"/>
-              </w:rPr>
-              <w:t>capacidade.</w:t>
+              <w:t>Sempre teste o limite: um array que nunca enche não ensina capacidade.</w:t>
             </w:r>
           </w:p>
         </w:tc>
@@ -8712,7 +8753,16 @@
           <w:color w:val="1A6B64"/>
           <w:sz w:val="30"/>
         </w:rPr>
-        <w:t>Práticas da aula</w:t>
+        <w:t>P</w:t>
+      </w:r>
+      <w:r>
+        <w:rPr>
+          <w:rFonts w:ascii="Trebuchet MS" w:eastAsia="Trebuchet MS" w:hAnsi="Trebuchet MS"/>
+          <w:b/>
+          <w:color w:val="1A6B64"/>
+          <w:sz w:val="30"/>
+        </w:rPr>
+        <w:t>ráticas da aula</w:t>
       </w:r>
       <w:bookmarkEnd w:id="26"/>
     </w:p>
@@ -9399,15 +9449,7 @@
                 <w:color w:val="8FBF7F"/>
                 <w:sz w:val="20"/>
               </w:rPr>
-              <w:t>f"[Falh</w:t>
-            </w:r>
-            <w:r>
-              <w:rPr>
-                <w:rFonts w:ascii="Consolas" w:eastAsia="Consolas" w:hAnsi="Consolas"/>
-                <w:color w:val="8FBF7F"/>
-                <w:sz w:val="20"/>
-              </w:rPr>
-              <w:t>a] Mochila cheia! Descarte algo para pegar {item}."</w:t>
+              <w:t>f"[Falha] Mochila cheia! Descarte algo para pegar {item}."</w:t>
             </w:r>
             <w:r>
               <w:rPr>
@@ -10178,7 +10220,7 @@
           <w:color w:val="0E2438"/>
           <w:sz w:val="44"/>
         </w:rPr>
-        <w:t>Listas Encadead</w:t>
+        <w:t xml:space="preserve">Listas </w:t>
       </w:r>
       <w:r>
         <w:rPr>
@@ -10187,7 +10229,7 @@
           <w:color w:val="0E2438"/>
           <w:sz w:val="44"/>
         </w:rPr>
-        <w:t>as (Linked Lists)</w:t>
+        <w:t>Encadeadas (Linked Lists)</w:t>
       </w:r>
       <w:bookmarkEnd w:id="27"/>
     </w:p>
@@ -10401,10 +10443,7 @@
               <w:fldChar w:fldCharType="begin"/>
             </w:r>
             <w:r>
-              <w:instrText xml:space="preserve"> PAGEREF s_se_deu</w:instrText>
-            </w:r>
-            <w:r>
-              <w:instrText xml:space="preserve">_erro_faca_isto \h </w:instrText>
+              <w:instrText xml:space="preserve"> PAGEREF s_se_deu_erro_faca_isto \h </w:instrText>
             </w:r>
             <w:r>
               <w:fldChar w:fldCharType="separate"/>
@@ -10461,13 +10500,13 @@
         <w:rPr>
           <w:rFonts w:eastAsia="Calibri"/>
         </w:rPr>
-        <w:t>A lista encadeada espalha os dados em qualquer gaveta liv</w:t>
-      </w:r>
-      <w:r>
-        <w:rPr>
-          <w:rFonts w:eastAsia="Calibri"/>
-        </w:rPr>
-        <w:t>re. Para não se perder, cada nó guarda duas coisas: o dado e o endereço do próximo nó.</w:t>
+        <w:t xml:space="preserve">A lista encadeada espalha os dados em qualquer gaveta livre. Para não se perder, </w:t>
+      </w:r>
+      <w:r>
+        <w:rPr>
+          <w:rFonts w:eastAsia="Calibri"/>
+        </w:rPr>
+        <w:t>cada nó guarda duas coisas: o dado e o endereço do próximo nó.</w:t>
       </w:r>
     </w:p>
     <w:p>
@@ -10588,7 +10627,7 @@
           <w:color w:val="5C5C5C"/>
           <w:sz w:val="18"/>
         </w:rPr>
-        <w:t xml:space="preserve">HEAD </w:t>
+        <w:t xml:space="preserve">HEAD aponta o primeiro nó; TAIL </w:t>
       </w:r>
       <w:r>
         <w:rPr>
@@ -10597,7 +10636,7 @@
           <w:color w:val="5C5C5C"/>
           <w:sz w:val="18"/>
         </w:rPr>
-        <w:t>aponta o primeiro nó; TAIL o último; o prox do último é None.</w:t>
+        <w:t>o último; o prox do último é None.</w:t>
       </w:r>
     </w:p>
     <w:p>
@@ -11073,7 +11112,15 @@
                 <w:color w:val="E08D5A"/>
                 <w:sz w:val="20"/>
               </w:rPr>
-              <w:t>def</w:t>
+              <w:t>d</w:t>
+            </w:r>
+            <w:r>
+              <w:rPr>
+                <w:rFonts w:ascii="Consolas" w:eastAsia="Consolas" w:hAnsi="Consolas"/>
+                <w:color w:val="E08D5A"/>
+                <w:sz w:val="20"/>
+              </w:rPr>
+              <w:t>ef</w:t>
             </w:r>
             <w:r>
               <w:rPr>
@@ -14187,14 +14234,7 @@
                 <w:rFonts w:eastAsia="Calibri"/>
                 <w:sz w:val="22"/>
               </w:rPr>
-              <w:t>Se a t</w:t>
-            </w:r>
-            <w:r>
-              <w:rPr>
-                <w:rFonts w:eastAsia="Calibri"/>
-                <w:sz w:val="22"/>
-              </w:rPr>
-              <w:t xml:space="preserve">ela falhar (Python não encontrado, pasta errada, NoneType), vá para </w:t>
+              <w:t xml:space="preserve">Se a tela falhar (Python não encontrado, pasta errada, NoneType), vá para </w:t>
             </w:r>
             <w:hyperlink w:anchor="s_se_deu_erro_faca_isto" w:history="1">
               <w:r>
@@ -14219,7 +14259,10 @@
               <w:fldChar w:fldCharType="begin"/>
             </w:r>
             <w:r>
-              <w:instrText xml:space="preserve"> PAGEREF s_se_deu_erro_faca_isto \h </w:instrText>
+              <w:instrText xml:space="preserve"> PAGEREF s_se_deu</w:instrText>
+            </w:r>
+            <w:r>
+              <w:instrText xml:space="preserve">_erro_faca_isto \h </w:instrText>
             </w:r>
             <w:r>
               <w:fldChar w:fldCharType="separate"/>
@@ -14276,13 +14319,13 @@
         <w:rPr>
           <w:rFonts w:eastAsia="Calibri"/>
         </w:rPr>
-        <w:t>Last In, First Out. Analogia: pilha de pratos. Só mexe no topo. Uso real: Ctrl+Z, botão Voltar do navegador,</w:t>
-      </w:r>
-      <w:r>
-        <w:rPr>
-          <w:rFonts w:eastAsia="Calibri"/>
-        </w:rPr>
-        <w:t xml:space="preserve"> pilha de chamadas do Python.</w:t>
+        <w:t xml:space="preserve">Last In, </w:t>
+      </w:r>
+      <w:r>
+        <w:rPr>
+          <w:rFonts w:eastAsia="Calibri"/>
+        </w:rPr>
+        <w:t>First Out. Analogia: pilha de pratos. Só mexe no topo. Uso real: Ctrl+Z, botão Voltar do navegador, pilha de chamadas do Python.</w:t>
       </w:r>
     </w:p>
     <w:p>
@@ -14368,7 +14411,13 @@
         <w:rPr>
           <w:rFonts w:eastAsia="Calibri"/>
         </w:rPr>
-        <w:t>First In, First Out. Analogia: fila de banco. Entra no fim, sai no início. Uso real: impressão, requisições de servidor, matchmaking de jogo.</w:t>
+        <w:t>First In, First Out. Analogia: fila de banco. Entr</w:t>
+      </w:r>
+      <w:r>
+        <w:rPr>
+          <w:rFonts w:eastAsia="Calibri"/>
+        </w:rPr>
+        <w:t>a no fim, sai no início. Uso real: impressão, requisições de servidor, matchmaking de jogo.</w:t>
       </w:r>
     </w:p>
     <w:p>
@@ -14430,16 +14479,7 @@
           <w:color w:val="5C5C5C"/>
           <w:sz w:val="18"/>
         </w:rPr>
-        <w:t>Ana e</w:t>
-      </w:r>
-      <w:r>
-        <w:rPr>
-          <w:rFonts w:eastAsia="Calibri"/>
-          <w:i/>
-          <w:color w:val="5C5C5C"/>
-          <w:sz w:val="18"/>
-        </w:rPr>
-        <w:t>ntra primeiro e sai primeiro. No slide da aula isso aparece como Head + deque; aqui a fila nasce nos nós.</w:t>
+        <w:t>Ana entra primeiro e sai primeiro. No slide da aula isso aparece como Head + deque; aqui a fila nasce nos nós.</w:t>
       </w:r>
     </w:p>
     <w:tbl>
@@ -14540,14 +14580,7 @@
                 <w:rFonts w:eastAsia="Calibri"/>
                 <w:sz w:val="22"/>
               </w:rPr>
-              <w:t xml:space="preserve">: todos os itens andam para a esquerda (Aula 1). Por isso a fila da live coding </w:t>
-            </w:r>
-            <w:r>
-              <w:rPr>
-                <w:rFonts w:eastAsia="Calibri"/>
-                <w:sz w:val="22"/>
-              </w:rPr>
-              <w:t xml:space="preserve">tem ponteiro de início e de fim na lista encadeada. Na prática do Call Center, </w:t>
+              <w:t xml:space="preserve">: todos os itens andam para a esquerda (Aula 1). Por isso a fila da live coding tem ponteiro de início e de fim na lista encadeada. Na prática do Call Center, </w:t>
             </w:r>
             <w:hyperlink w:anchor="glossario_s_deque" w:history="1">
               <w:r>
@@ -14565,7 +14598,14 @@
                 <w:rFonts w:eastAsia="Calibri"/>
                 <w:sz w:val="22"/>
               </w:rPr>
-              <w:t xml:space="preserve"> resolve as duas pontas em </w:t>
+              <w:t xml:space="preserve"> resolve as duas pon</w:t>
+            </w:r>
+            <w:r>
+              <w:rPr>
+                <w:rFonts w:eastAsia="Calibri"/>
+                <w:sz w:val="22"/>
+              </w:rPr>
+              <w:t xml:space="preserve">tas em </w:t>
             </w:r>
             <w:r>
               <w:rPr>
@@ -14630,16 +14670,7 @@
           <w:color w:val="1A6B64"/>
           <w:sz w:val="30"/>
         </w:rPr>
-        <w:t xml:space="preserve">Live coding: pilha e fila sobre </w:t>
-      </w:r>
-      <w:r>
-        <w:rPr>
-          <w:rFonts w:ascii="Trebuchet MS" w:eastAsia="Trebuchet MS" w:hAnsi="Trebuchet MS"/>
-          <w:b/>
-          <w:color w:val="1A6B64"/>
-          <w:sz w:val="30"/>
-        </w:rPr>
-        <w:t>nós</w:t>
+        <w:t>Live coding: pilha e fila sobre nós</w:t>
       </w:r>
       <w:bookmarkEnd w:id="35"/>
     </w:p>
@@ -15109,15 +15140,7 @@
                 <w:color w:val="D6DEE4"/>
                 <w:sz w:val="20"/>
               </w:rPr>
-              <w:t xml:space="preserve">        </w:t>
-            </w:r>
-            <w:r>
-              <w:rPr>
-                <w:rFonts w:ascii="Consolas" w:eastAsia="Consolas" w:hAnsi="Consolas"/>
-                <w:color w:val="D6DEE4"/>
-                <w:sz w:val="20"/>
-              </w:rPr>
-              <w:t xml:space="preserve">novo.proximo = </w:t>
+              <w:t xml:space="preserve">        novo.proximo = </w:t>
             </w:r>
             <w:r>
               <w:rPr>
@@ -16012,6 +16035,212 @@
                 <w:color w:val="D6DEE4"/>
                 <w:sz w:val="20"/>
               </w:rPr>
+              <w:t>.fim = novo</w:t>
+            </w:r>
+          </w:p>
+          <w:p>
+            <w:pPr>
+              <w:spacing w:after="0" w:line="259" w:lineRule="auto"/>
+            </w:pPr>
+            <w:r>
+              <w:rPr>
+                <w:rFonts w:ascii="Consolas" w:eastAsia="Consolas" w:hAnsi="Consolas"/>
+                <w:color w:val="D6DEE4"/>
+                <w:sz w:val="20"/>
+              </w:rPr>
+              <w:t xml:space="preserve">        </w:t>
+            </w:r>
+            <w:r>
+              <w:rPr>
+                <w:rFonts w:ascii="Consolas" w:eastAsia="Consolas" w:hAnsi="Consolas"/>
+                <w:color w:val="E08D5A"/>
+                <w:sz w:val="20"/>
+              </w:rPr>
+              <w:t>else</w:t>
+            </w:r>
+            <w:r>
+              <w:rPr>
+                <w:rFonts w:ascii="Consolas" w:eastAsia="Consolas" w:hAnsi="Consolas"/>
+                <w:color w:val="D6DEE4"/>
+                <w:sz w:val="20"/>
+              </w:rPr>
+              <w:t>:</w:t>
+            </w:r>
+          </w:p>
+          <w:p>
+            <w:pPr>
+              <w:spacing w:after="0" w:line="259" w:lineRule="auto"/>
+            </w:pPr>
+            <w:r>
+              <w:rPr>
+                <w:rFonts w:ascii="Consolas" w:eastAsia="Consolas" w:hAnsi="Consolas"/>
+                <w:color w:val="D6DEE4"/>
+                <w:sz w:val="20"/>
+              </w:rPr>
+              <w:t xml:space="preserve">            </w:t>
+            </w:r>
+            <w:r>
+              <w:rPr>
+                <w:rFonts w:ascii="Consolas" w:eastAsia="Consolas" w:hAnsi="Consolas"/>
+                <w:color w:val="E08D5A"/>
+                <w:sz w:val="20"/>
+              </w:rPr>
+              <w:t>self</w:t>
+            </w:r>
+            <w:r>
+              <w:rPr>
+                <w:rFonts w:ascii="Consolas" w:eastAsia="Consolas" w:hAnsi="Consolas"/>
+                <w:color w:val="D6DEE4"/>
+                <w:sz w:val="20"/>
+              </w:rPr>
+              <w:t>.fim.proximo = novo</w:t>
+            </w:r>
+          </w:p>
+          <w:p>
+            <w:pPr>
+              <w:spacing w:after="0" w:line="259" w:lineRule="auto"/>
+            </w:pPr>
+            <w:r>
+              <w:rPr>
+                <w:rFonts w:ascii="Consolas" w:eastAsia="Consolas" w:hAnsi="Consolas"/>
+                <w:color w:val="D6DEE4"/>
+                <w:sz w:val="20"/>
+              </w:rPr>
+              <w:t xml:space="preserve">            </w:t>
+            </w:r>
+            <w:r>
+              <w:rPr>
+                <w:rFonts w:ascii="Consolas" w:eastAsia="Consolas" w:hAnsi="Consolas"/>
+                <w:color w:val="E08D5A"/>
+                <w:sz w:val="20"/>
+              </w:rPr>
+              <w:t>self</w:t>
+            </w:r>
+            <w:r>
+              <w:rPr>
+                <w:rFonts w:ascii="Consolas" w:eastAsia="Consolas" w:hAnsi="Consolas"/>
+                <w:color w:val="D6DEE4"/>
+                <w:sz w:val="20"/>
+              </w:rPr>
+              <w:t>.fim = novo</w:t>
+            </w:r>
+          </w:p>
+          <w:p>
+            <w:pPr>
+              <w:spacing w:after="0" w:line="259" w:lineRule="auto"/>
+            </w:pPr>
+            <w:r>
+              <w:rPr>
+                <w:rFonts w:ascii="Consolas" w:eastAsia="Consolas" w:hAnsi="Consolas"/>
+                <w:color w:val="D6DEE4"/>
+                <w:sz w:val="20"/>
+              </w:rPr>
+              <w:t xml:space="preserve"> </w:t>
+            </w:r>
+          </w:p>
+          <w:p>
+            <w:pPr>
+              <w:spacing w:after="0" w:line="259" w:lineRule="auto"/>
+            </w:pPr>
+            <w:r>
+              <w:rPr>
+                <w:rFonts w:ascii="Consolas" w:eastAsia="Consolas" w:hAnsi="Consolas"/>
+                <w:color w:val="D6DEE4"/>
+                <w:sz w:val="20"/>
+              </w:rPr>
+              <w:t xml:space="preserve">    </w:t>
+            </w:r>
+            <w:r>
+              <w:rPr>
+                <w:rFonts w:ascii="Consolas" w:eastAsia="Consolas" w:hAnsi="Consolas"/>
+                <w:color w:val="E08D5A"/>
+                <w:sz w:val="20"/>
+              </w:rPr>
+              <w:t>def</w:t>
+            </w:r>
+            <w:r>
+              <w:rPr>
+                <w:rFonts w:ascii="Consolas" w:eastAsia="Consolas" w:hAnsi="Consolas"/>
+                <w:color w:val="D6DEE4"/>
+                <w:sz w:val="20"/>
+              </w:rPr>
+              <w:t xml:space="preserve"> </w:t>
+            </w:r>
+            <w:r>
+              <w:rPr>
+                <w:rFonts w:ascii="Consolas" w:eastAsia="Consolas" w:hAnsi="Consolas"/>
+                <w:color w:val="E8C07A"/>
+                <w:sz w:val="20"/>
+              </w:rPr>
+              <w:t>desenfileirar</w:t>
+            </w:r>
+            <w:r>
+              <w:rPr>
+                <w:rFonts w:ascii="Consolas" w:eastAsia="Consolas" w:hAnsi="Consolas"/>
+                <w:color w:val="D6DEE4"/>
+                <w:sz w:val="20"/>
+              </w:rPr>
+              <w:t>(</w:t>
+            </w:r>
+            <w:r>
+              <w:rPr>
+                <w:rFonts w:ascii="Consolas" w:eastAsia="Consolas" w:hAnsi="Consolas"/>
+                <w:color w:val="E08D5A"/>
+                <w:sz w:val="20"/>
+              </w:rPr>
+              <w:t>self</w:t>
+            </w:r>
+            <w:r>
+              <w:rPr>
+                <w:rFonts w:ascii="Consolas" w:eastAsia="Consolas" w:hAnsi="Consolas"/>
+                <w:color w:val="D6DEE4"/>
+                <w:sz w:val="20"/>
+              </w:rPr>
+              <w:t>):</w:t>
+            </w:r>
+          </w:p>
+          <w:p>
+            <w:pPr>
+              <w:spacing w:after="0" w:line="259" w:lineRule="auto"/>
+            </w:pPr>
+            <w:r>
+              <w:rPr>
+                <w:rFonts w:ascii="Consolas" w:eastAsia="Consolas" w:hAnsi="Consolas"/>
+                <w:color w:val="D6DEE4"/>
+                <w:sz w:val="20"/>
+              </w:rPr>
+              <w:t xml:space="preserve">        </w:t>
+            </w:r>
+            <w:r>
+              <w:rPr>
+                <w:rFonts w:ascii="Consolas" w:eastAsia="Consolas" w:hAnsi="Consolas"/>
+                <w:color w:val="E08D5A"/>
+                <w:sz w:val="20"/>
+              </w:rPr>
+              <w:t>if</w:t>
+            </w:r>
+            <w:r>
+              <w:rPr>
+                <w:rFonts w:ascii="Consolas" w:eastAsia="Consolas" w:hAnsi="Consolas"/>
+                <w:color w:val="D6DEE4"/>
+                <w:sz w:val="20"/>
+              </w:rPr>
+              <w:t xml:space="preserve"> </w:t>
+            </w:r>
+            <w:r>
+              <w:rPr>
+                <w:rFonts w:ascii="Consolas" w:eastAsia="Consolas" w:hAnsi="Consolas"/>
+                <w:color w:val="E08D5A"/>
+                <w:sz w:val="20"/>
+              </w:rPr>
+              <w:t>self</w:t>
+            </w:r>
+            <w:r>
+              <w:rPr>
+                <w:rFonts w:ascii="Consolas" w:eastAsia="Consolas" w:hAnsi="Consolas"/>
+                <w:color w:val="D6DEE4"/>
+                <w:sz w:val="20"/>
+              </w:rPr>
               <w:t>.</w:t>
             </w:r>
             <w:r>
@@ -16020,7 +16249,39 @@
                 <w:color w:val="D6DEE4"/>
                 <w:sz w:val="20"/>
               </w:rPr>
-              <w:t>fim = novo</w:t>
+              <w:t xml:space="preserve">inicio </w:t>
+            </w:r>
+            <w:r>
+              <w:rPr>
+                <w:rFonts w:ascii="Consolas" w:eastAsia="Consolas" w:hAnsi="Consolas"/>
+                <w:color w:val="E08D5A"/>
+                <w:sz w:val="20"/>
+              </w:rPr>
+              <w:t>is</w:t>
+            </w:r>
+            <w:r>
+              <w:rPr>
+                <w:rFonts w:ascii="Consolas" w:eastAsia="Consolas" w:hAnsi="Consolas"/>
+                <w:color w:val="D6DEE4"/>
+                <w:sz w:val="20"/>
+              </w:rPr>
+              <w:t xml:space="preserve"> </w:t>
+            </w:r>
+            <w:r>
+              <w:rPr>
+                <w:rFonts w:ascii="Consolas" w:eastAsia="Consolas" w:hAnsi="Consolas"/>
+                <w:color w:val="E08D5A"/>
+                <w:sz w:val="20"/>
+              </w:rPr>
+              <w:t>None</w:t>
+            </w:r>
+            <w:r>
+              <w:rPr>
+                <w:rFonts w:ascii="Consolas" w:eastAsia="Consolas" w:hAnsi="Consolas"/>
+                <w:color w:val="D6DEE4"/>
+                <w:sz w:val="20"/>
+              </w:rPr>
+              <w:t>:</w:t>
             </w:r>
           </w:p>
           <w:p>
@@ -16033,6 +16294,80 @@
                 <w:color w:val="D6DEE4"/>
                 <w:sz w:val="20"/>
               </w:rPr>
+              <w:t xml:space="preserve">            </w:t>
+            </w:r>
+            <w:r>
+              <w:rPr>
+                <w:rFonts w:ascii="Consolas" w:eastAsia="Consolas" w:hAnsi="Consolas"/>
+                <w:color w:val="E08D5A"/>
+                <w:sz w:val="20"/>
+              </w:rPr>
+              <w:t>raise</w:t>
+            </w:r>
+            <w:r>
+              <w:rPr>
+                <w:rFonts w:ascii="Consolas" w:eastAsia="Consolas" w:hAnsi="Consolas"/>
+                <w:color w:val="D6DEE4"/>
+                <w:sz w:val="20"/>
+              </w:rPr>
+              <w:t xml:space="preserve"> IndexError(</w:t>
+            </w:r>
+            <w:r>
+              <w:rPr>
+                <w:rFonts w:ascii="Consolas" w:eastAsia="Consolas" w:hAnsi="Consolas"/>
+                <w:color w:val="8FBF7F"/>
+                <w:sz w:val="20"/>
+              </w:rPr>
+              <w:t>"Fila vazia."</w:t>
+            </w:r>
+            <w:r>
+              <w:rPr>
+                <w:rFonts w:ascii="Consolas" w:eastAsia="Consolas" w:hAnsi="Consolas"/>
+                <w:color w:val="D6DEE4"/>
+                <w:sz w:val="20"/>
+              </w:rPr>
+              <w:t>)</w:t>
+            </w:r>
+          </w:p>
+          <w:p>
+            <w:pPr>
+              <w:spacing w:after="0" w:line="259" w:lineRule="auto"/>
+            </w:pPr>
+            <w:r>
+              <w:rPr>
+                <w:rFonts w:ascii="Consolas" w:eastAsia="Consolas" w:hAnsi="Consolas"/>
+                <w:color w:val="D6DEE4"/>
+                <w:sz w:val="20"/>
+              </w:rPr>
+              <w:t xml:space="preserve">        dado = </w:t>
+            </w:r>
+            <w:r>
+              <w:rPr>
+                <w:rFonts w:ascii="Consolas" w:eastAsia="Consolas" w:hAnsi="Consolas"/>
+                <w:color w:val="E08D5A"/>
+                <w:sz w:val="20"/>
+              </w:rPr>
+              <w:t>self</w:t>
+            </w:r>
+            <w:r>
+              <w:rPr>
+                <w:rFonts w:ascii="Consolas" w:eastAsia="Consolas" w:hAnsi="Consolas"/>
+                <w:color w:val="D6DEE4"/>
+                <w:sz w:val="20"/>
+              </w:rPr>
+              <w:t>.inicio.dado</w:t>
+            </w:r>
+          </w:p>
+          <w:p>
+            <w:pPr>
+              <w:spacing w:after="0" w:line="259" w:lineRule="auto"/>
+            </w:pPr>
+            <w:r>
+              <w:rPr>
+                <w:rFonts w:ascii="Consolas" w:eastAsia="Consolas" w:hAnsi="Consolas"/>
+                <w:color w:val="D6DEE4"/>
+                <w:sz w:val="20"/>
+              </w:rPr>
               <w:t xml:space="preserve">        </w:t>
             </w:r>
             <w:r>
@@ -16041,28 +16376,15 @@
                 <w:color w:val="E08D5A"/>
                 <w:sz w:val="20"/>
               </w:rPr>
-              <w:t>else</w:t>
-            </w:r>
-            <w:r>
-              <w:rPr>
-                <w:rFonts w:ascii="Consolas" w:eastAsia="Consolas" w:hAnsi="Consolas"/>
-                <w:color w:val="D6DEE4"/>
-                <w:sz w:val="20"/>
-              </w:rPr>
-              <w:t>:</w:t>
-            </w:r>
-          </w:p>
-          <w:p>
-            <w:pPr>
-              <w:spacing w:after="0" w:line="259" w:lineRule="auto"/>
-            </w:pPr>
-            <w:r>
-              <w:rPr>
-                <w:rFonts w:ascii="Consolas" w:eastAsia="Consolas" w:hAnsi="Consolas"/>
-                <w:color w:val="D6DEE4"/>
-                <w:sz w:val="20"/>
-              </w:rPr>
-              <w:t xml:space="preserve">            </w:t>
+              <w:t>self</w:t>
+            </w:r>
+            <w:r>
+              <w:rPr>
+                <w:rFonts w:ascii="Consolas" w:eastAsia="Consolas" w:hAnsi="Consolas"/>
+                <w:color w:val="D6DEE4"/>
+                <w:sz w:val="20"/>
+              </w:rPr>
+              <w:t xml:space="preserve">.inicio = </w:t>
             </w:r>
             <w:r>
               <w:rPr>
@@ -16078,314 +16400,7 @@
                 <w:color w:val="D6DEE4"/>
                 <w:sz w:val="20"/>
               </w:rPr>
-              <w:t>.fim.proximo = novo</w:t>
-            </w:r>
-          </w:p>
-          <w:p>
-            <w:pPr>
-              <w:spacing w:after="0" w:line="259" w:lineRule="auto"/>
-            </w:pPr>
-            <w:r>
-              <w:rPr>
-                <w:rFonts w:ascii="Consolas" w:eastAsia="Consolas" w:hAnsi="Consolas"/>
-                <w:color w:val="D6DEE4"/>
-                <w:sz w:val="20"/>
-              </w:rPr>
-              <w:t xml:space="preserve">            </w:t>
-            </w:r>
-            <w:r>
-              <w:rPr>
-                <w:rFonts w:ascii="Consolas" w:eastAsia="Consolas" w:hAnsi="Consolas"/>
-                <w:color w:val="E08D5A"/>
-                <w:sz w:val="20"/>
-              </w:rPr>
-              <w:t>self</w:t>
-            </w:r>
-            <w:r>
-              <w:rPr>
-                <w:rFonts w:ascii="Consolas" w:eastAsia="Consolas" w:hAnsi="Consolas"/>
-                <w:color w:val="D6DEE4"/>
-                <w:sz w:val="20"/>
-              </w:rPr>
-              <w:t>.fim = novo</w:t>
-            </w:r>
-          </w:p>
-          <w:p>
-            <w:pPr>
-              <w:spacing w:after="0" w:line="259" w:lineRule="auto"/>
-            </w:pPr>
-            <w:r>
-              <w:rPr>
-                <w:rFonts w:ascii="Consolas" w:eastAsia="Consolas" w:hAnsi="Consolas"/>
-                <w:color w:val="D6DEE4"/>
-                <w:sz w:val="20"/>
-              </w:rPr>
-              <w:t xml:space="preserve"> </w:t>
-            </w:r>
-          </w:p>
-          <w:p>
-            <w:pPr>
-              <w:spacing w:after="0" w:line="259" w:lineRule="auto"/>
-            </w:pPr>
-            <w:r>
-              <w:rPr>
-                <w:rFonts w:ascii="Consolas" w:eastAsia="Consolas" w:hAnsi="Consolas"/>
-                <w:color w:val="D6DEE4"/>
-                <w:sz w:val="20"/>
-              </w:rPr>
-              <w:t xml:space="preserve">    </w:t>
-            </w:r>
-            <w:r>
-              <w:rPr>
-                <w:rFonts w:ascii="Consolas" w:eastAsia="Consolas" w:hAnsi="Consolas"/>
-                <w:color w:val="E08D5A"/>
-                <w:sz w:val="20"/>
-              </w:rPr>
-              <w:t>def</w:t>
-            </w:r>
-            <w:r>
-              <w:rPr>
-                <w:rFonts w:ascii="Consolas" w:eastAsia="Consolas" w:hAnsi="Consolas"/>
-                <w:color w:val="D6DEE4"/>
-                <w:sz w:val="20"/>
-              </w:rPr>
-              <w:t xml:space="preserve"> </w:t>
-            </w:r>
-            <w:r>
-              <w:rPr>
-                <w:rFonts w:ascii="Consolas" w:eastAsia="Consolas" w:hAnsi="Consolas"/>
-                <w:color w:val="E8C07A"/>
-                <w:sz w:val="20"/>
-              </w:rPr>
-              <w:t>desenfileirar</w:t>
-            </w:r>
-            <w:r>
-              <w:rPr>
-                <w:rFonts w:ascii="Consolas" w:eastAsia="Consolas" w:hAnsi="Consolas"/>
-                <w:color w:val="D6DEE4"/>
-                <w:sz w:val="20"/>
-              </w:rPr>
-              <w:t>(</w:t>
-            </w:r>
-            <w:r>
-              <w:rPr>
-                <w:rFonts w:ascii="Consolas" w:eastAsia="Consolas" w:hAnsi="Consolas"/>
-                <w:color w:val="E08D5A"/>
-                <w:sz w:val="20"/>
-              </w:rPr>
-              <w:t>self</w:t>
-            </w:r>
-            <w:r>
-              <w:rPr>
-                <w:rFonts w:ascii="Consolas" w:eastAsia="Consolas" w:hAnsi="Consolas"/>
-                <w:color w:val="D6DEE4"/>
-                <w:sz w:val="20"/>
-              </w:rPr>
-              <w:t>):</w:t>
-            </w:r>
-          </w:p>
-          <w:p>
-            <w:pPr>
-              <w:spacing w:after="0" w:line="259" w:lineRule="auto"/>
-            </w:pPr>
-            <w:r>
-              <w:rPr>
-                <w:rFonts w:ascii="Consolas" w:eastAsia="Consolas" w:hAnsi="Consolas"/>
-                <w:color w:val="D6DEE4"/>
-                <w:sz w:val="20"/>
-              </w:rPr>
-              <w:t xml:space="preserve">        </w:t>
-            </w:r>
-            <w:r>
-              <w:rPr>
-                <w:rFonts w:ascii="Consolas" w:eastAsia="Consolas" w:hAnsi="Consolas"/>
-                <w:color w:val="E08D5A"/>
-                <w:sz w:val="20"/>
-              </w:rPr>
-              <w:t>if</w:t>
-            </w:r>
-            <w:r>
-              <w:rPr>
-                <w:rFonts w:ascii="Consolas" w:eastAsia="Consolas" w:hAnsi="Consolas"/>
-                <w:color w:val="D6DEE4"/>
-                <w:sz w:val="20"/>
-              </w:rPr>
-              <w:t xml:space="preserve"> </w:t>
-            </w:r>
-            <w:r>
-              <w:rPr>
-                <w:rFonts w:ascii="Consolas" w:eastAsia="Consolas" w:hAnsi="Consolas"/>
-                <w:color w:val="E08D5A"/>
-                <w:sz w:val="20"/>
-              </w:rPr>
-              <w:t>self</w:t>
-            </w:r>
-            <w:r>
-              <w:rPr>
-                <w:rFonts w:ascii="Consolas" w:eastAsia="Consolas" w:hAnsi="Consolas"/>
-                <w:color w:val="D6DEE4"/>
-                <w:sz w:val="20"/>
-              </w:rPr>
-              <w:t xml:space="preserve">.inicio </w:t>
-            </w:r>
-            <w:r>
-              <w:rPr>
-                <w:rFonts w:ascii="Consolas" w:eastAsia="Consolas" w:hAnsi="Consolas"/>
-                <w:color w:val="E08D5A"/>
-                <w:sz w:val="20"/>
-              </w:rPr>
-              <w:t>is</w:t>
-            </w:r>
-            <w:r>
-              <w:rPr>
-                <w:rFonts w:ascii="Consolas" w:eastAsia="Consolas" w:hAnsi="Consolas"/>
-                <w:color w:val="D6DEE4"/>
-                <w:sz w:val="20"/>
-              </w:rPr>
-              <w:t xml:space="preserve"> </w:t>
-            </w:r>
-            <w:r>
-              <w:rPr>
-                <w:rFonts w:ascii="Consolas" w:eastAsia="Consolas" w:hAnsi="Consolas"/>
-                <w:color w:val="E08D5A"/>
-                <w:sz w:val="20"/>
-              </w:rPr>
-              <w:t>None</w:t>
-            </w:r>
-            <w:r>
-              <w:rPr>
-                <w:rFonts w:ascii="Consolas" w:eastAsia="Consolas" w:hAnsi="Consolas"/>
-                <w:color w:val="D6DEE4"/>
-                <w:sz w:val="20"/>
-              </w:rPr>
-              <w:t>:</w:t>
-            </w:r>
-          </w:p>
-          <w:p>
-            <w:pPr>
-              <w:spacing w:after="0" w:line="259" w:lineRule="auto"/>
-            </w:pPr>
-            <w:r>
-              <w:rPr>
-                <w:rFonts w:ascii="Consolas" w:eastAsia="Consolas" w:hAnsi="Consolas"/>
-                <w:color w:val="D6DEE4"/>
-                <w:sz w:val="20"/>
-              </w:rPr>
-              <w:t xml:space="preserve">            </w:t>
-            </w:r>
-            <w:r>
-              <w:rPr>
-                <w:rFonts w:ascii="Consolas" w:eastAsia="Consolas" w:hAnsi="Consolas"/>
-                <w:color w:val="E08D5A"/>
-                <w:sz w:val="20"/>
-              </w:rPr>
-              <w:t>raise</w:t>
-            </w:r>
-            <w:r>
-              <w:rPr>
-                <w:rFonts w:ascii="Consolas" w:eastAsia="Consolas" w:hAnsi="Consolas"/>
-                <w:color w:val="D6DEE4"/>
-                <w:sz w:val="20"/>
-              </w:rPr>
-              <w:t xml:space="preserve"> IndexError(</w:t>
-            </w:r>
-            <w:r>
-              <w:rPr>
-                <w:rFonts w:ascii="Consolas" w:eastAsia="Consolas" w:hAnsi="Consolas"/>
-                <w:color w:val="8FBF7F"/>
-                <w:sz w:val="20"/>
-              </w:rPr>
-              <w:t>"Fila vazia."</w:t>
-            </w:r>
-            <w:r>
-              <w:rPr>
-                <w:rFonts w:ascii="Consolas" w:eastAsia="Consolas" w:hAnsi="Consolas"/>
-                <w:color w:val="D6DEE4"/>
-                <w:sz w:val="20"/>
-              </w:rPr>
-              <w:t>)</w:t>
-            </w:r>
-          </w:p>
-          <w:p>
-            <w:pPr>
-              <w:spacing w:after="0" w:line="259" w:lineRule="auto"/>
-            </w:pPr>
-            <w:r>
-              <w:rPr>
-                <w:rFonts w:ascii="Consolas" w:eastAsia="Consolas" w:hAnsi="Consolas"/>
-                <w:color w:val="D6DEE4"/>
-                <w:sz w:val="20"/>
-              </w:rPr>
-              <w:t xml:space="preserve">        dado = </w:t>
-            </w:r>
-            <w:r>
-              <w:rPr>
-                <w:rFonts w:ascii="Consolas" w:eastAsia="Consolas" w:hAnsi="Consolas"/>
-                <w:color w:val="E08D5A"/>
-                <w:sz w:val="20"/>
-              </w:rPr>
-              <w:t>self</w:t>
-            </w:r>
-            <w:r>
-              <w:rPr>
-                <w:rFonts w:ascii="Consolas" w:eastAsia="Consolas" w:hAnsi="Consolas"/>
-                <w:color w:val="D6DEE4"/>
-                <w:sz w:val="20"/>
-              </w:rPr>
-              <w:t>.inicio.dado</w:t>
-            </w:r>
-          </w:p>
-          <w:p>
-            <w:pPr>
-              <w:spacing w:after="0" w:line="259" w:lineRule="auto"/>
-            </w:pPr>
-            <w:r>
-              <w:rPr>
-                <w:rFonts w:ascii="Consolas" w:eastAsia="Consolas" w:hAnsi="Consolas"/>
-                <w:color w:val="D6DEE4"/>
-                <w:sz w:val="20"/>
-              </w:rPr>
-              <w:t xml:space="preserve">        </w:t>
-            </w:r>
-            <w:r>
-              <w:rPr>
-                <w:rFonts w:ascii="Consolas" w:eastAsia="Consolas" w:hAnsi="Consolas"/>
-                <w:color w:val="E08D5A"/>
-                <w:sz w:val="20"/>
-              </w:rPr>
-              <w:t>self</w:t>
-            </w:r>
-            <w:r>
-              <w:rPr>
-                <w:rFonts w:ascii="Consolas" w:eastAsia="Consolas" w:hAnsi="Consolas"/>
-                <w:color w:val="D6DEE4"/>
-                <w:sz w:val="20"/>
-              </w:rPr>
-              <w:t xml:space="preserve">.inicio = </w:t>
-            </w:r>
-            <w:r>
-              <w:rPr>
-                <w:rFonts w:ascii="Consolas" w:eastAsia="Consolas" w:hAnsi="Consolas"/>
-                <w:color w:val="E08D5A"/>
-                <w:sz w:val="20"/>
-              </w:rPr>
-              <w:t>self</w:t>
-            </w:r>
-            <w:r>
-              <w:rPr>
-                <w:rFonts w:ascii="Consolas" w:eastAsia="Consolas" w:hAnsi="Consolas"/>
-                <w:color w:val="D6DEE4"/>
-                <w:sz w:val="20"/>
-              </w:rPr>
-              <w:t>.</w:t>
-            </w:r>
-            <w:r>
-              <w:rPr>
-                <w:rFonts w:ascii="Consolas" w:eastAsia="Consolas" w:hAnsi="Consolas"/>
-                <w:color w:val="D6DEE4"/>
-                <w:sz w:val="20"/>
-              </w:rPr>
-              <w:t>inicio.proximo</w:t>
+              <w:t>.inicio.proximo</w:t>
             </w:r>
           </w:p>
           <w:p>
@@ -16748,14 +16763,14 @@
                 <w:rFonts w:eastAsia="Calibri"/>
                 <w:sz w:val="22"/>
               </w:rPr>
-              <w:t xml:space="preserve">Vocês foram contratados para o balcão de um Call </w:t>
+              <w:t xml:space="preserve">Vocês foram contratados para o balcão de um Call Center. Clientes entram numa fila de espera e são atendidos na ordem de chegada. O atendente às vezes encerra o chamado sem querer: precisa </w:t>
             </w:r>
             <w:r>
               <w:rPr>
                 <w:rFonts w:eastAsia="Calibri"/>
                 <w:sz w:val="22"/>
               </w:rPr>
-              <w:t>Center. Clientes entram numa fila de espera e são atendidos na ordem de chegada. O atendente às vezes encerra o chamado sem querer: precisa de uma pilha de histórico para desfazer o último encerramento e devolver o cliente ao início da fila (não ao fim).</w:t>
+              <w:t>de uma pilha de histórico para desfazer o último encerramento e devolver o cliente ao início da fila (não ao fim).</w:t>
             </w:r>
           </w:p>
         </w:tc>
@@ -17203,7 +17218,15 @@
                 <w:color w:val="D6DEE4"/>
                 <w:sz w:val="20"/>
               </w:rPr>
-              <w:t>.fila_espera.append(nome)</w:t>
+              <w:t>.fila_espera.append(</w:t>
+            </w:r>
+            <w:r>
+              <w:rPr>
+                <w:rFonts w:ascii="Consolas" w:eastAsia="Consolas" w:hAnsi="Consolas"/>
+                <w:color w:val="D6DEE4"/>
+                <w:sz w:val="20"/>
+              </w:rPr>
+              <w:t>nome)</w:t>
             </w:r>
           </w:p>
           <w:p>
@@ -17465,7 +17488,15 @@
                 <w:color w:val="D6DEE4"/>
                 <w:sz w:val="20"/>
               </w:rPr>
-              <w:t>.historico_acoes.append(cliente_atendido)</w:t>
+              <w:t>.historico_acoes.append(</w:t>
+            </w:r>
+            <w:r>
+              <w:rPr>
+                <w:rFonts w:ascii="Consolas" w:eastAsia="Consolas" w:hAnsi="Consolas"/>
+                <w:color w:val="D6DEE4"/>
+                <w:sz w:val="20"/>
+              </w:rPr>
+              <w:t>cliente_atendido)</w:t>
             </w:r>
           </w:p>
           <w:p>
@@ -17748,7 +17779,15 @@
                 <w:color w:val="D6DEE4"/>
                 <w:sz w:val="20"/>
               </w:rPr>
-              <w:t xml:space="preserve">            cliente_recuperado = </w:t>
+              <w:t xml:space="preserve">     </w:t>
+            </w:r>
+            <w:r>
+              <w:rPr>
+                <w:rFonts w:ascii="Consolas" w:eastAsia="Consolas" w:hAnsi="Consolas"/>
+                <w:color w:val="D6DEE4"/>
+                <w:sz w:val="20"/>
+              </w:rPr>
+              <w:t xml:space="preserve">       cliente_recuperado = </w:t>
             </w:r>
             <w:r>
               <w:rPr>
@@ -17912,7 +17951,15 @@
                 <w:color w:val="8FBF7F"/>
                 <w:sz w:val="20"/>
               </w:rPr>
-              <w:t>"[Desfazer] Não há ações recentes para desfazer."</w:t>
+              <w:t>"[Desfazer] Não</w:t>
+            </w:r>
+            <w:r>
+              <w:rPr>
+                <w:rFonts w:ascii="Consolas" w:eastAsia="Consolas" w:hAnsi="Consolas"/>
+                <w:color w:val="8FBF7F"/>
+                <w:sz w:val="20"/>
+              </w:rPr>
+              <w:t xml:space="preserve"> há ações recentes para desfazer."</w:t>
             </w:r>
             <w:r>
               <w:rPr>
@@ -18031,7 +18078,44 @@
                 <w:color w:val="8FBF7F"/>
                 <w:sz w:val="20"/>
               </w:rPr>
-              <w:t>f"\nPainel - Fila atual: {list(self.fila_</w:t>
+              <w:t>f"\nPainel - Fila atual: {list(self.fila_espera)}"</w:t>
+            </w:r>
+            <w:r>
+              <w:rPr>
+                <w:rFonts w:ascii="Consolas" w:eastAsia="Consolas" w:hAnsi="Consolas"/>
+                <w:color w:val="D6DEE4"/>
+                <w:sz w:val="20"/>
+              </w:rPr>
+              <w:t>)</w:t>
+            </w:r>
+          </w:p>
+          <w:p>
+            <w:pPr>
+              <w:spacing w:after="0" w:line="259" w:lineRule="auto"/>
+            </w:pPr>
+            <w:r>
+              <w:rPr>
+                <w:rFonts w:ascii="Consolas" w:eastAsia="Consolas" w:hAnsi="Consolas"/>
+                <w:color w:val="D6DEE4"/>
+                <w:sz w:val="20"/>
+              </w:rPr>
+              <w:t xml:space="preserve">        </w:t>
+            </w:r>
+            <w:r>
+              <w:rPr>
+                <w:rFonts w:ascii="Consolas" w:eastAsia="Consolas" w:hAnsi="Consolas"/>
+                <w:color w:val="E8C07A"/>
+                <w:sz w:val="20"/>
+              </w:rPr>
+              <w:t>print</w:t>
+            </w:r>
+            <w:r>
+              <w:rPr>
+                <w:rFonts w:ascii="Consolas" w:eastAsia="Consolas" w:hAnsi="Consolas"/>
+                <w:color w:val="D6DEE4"/>
+                <w:sz w:val="20"/>
+              </w:rPr>
+              <w:t>(</w:t>
             </w:r>
             <w:r>
               <w:rPr>
@@ -18039,7 +18123,23 @@
                 <w:color w:val="8FBF7F"/>
                 <w:sz w:val="20"/>
               </w:rPr>
-              <w:t>espera)}"</w:t>
+              <w:t>"-"</w:t>
+            </w:r>
+            <w:r>
+              <w:rPr>
+                <w:rFonts w:ascii="Consolas" w:eastAsia="Consolas" w:hAnsi="Consolas"/>
+                <w:color w:val="D6DEE4"/>
+                <w:sz w:val="20"/>
+              </w:rPr>
+              <w:t xml:space="preserve"> * </w:t>
+            </w:r>
+            <w:r>
+              <w:rPr>
+                <w:rFonts w:ascii="Consolas" w:eastAsia="Consolas" w:hAnsi="Consolas"/>
+                <w:color w:val="D8C072"/>
+                <w:sz w:val="20"/>
+              </w:rPr>
+              <w:t>30</w:t>
             </w:r>
             <w:r>
               <w:rPr>
@@ -18060,23 +18160,46 @@
                 <w:color w:val="D6DEE4"/>
                 <w:sz w:val="20"/>
               </w:rPr>
-              <w:t xml:space="preserve">        </w:t>
-            </w:r>
-            <w:r>
-              <w:rPr>
-                <w:rFonts w:ascii="Consolas" w:eastAsia="Consolas" w:hAnsi="Consolas"/>
-                <w:color w:val="E8C07A"/>
-                <w:sz w:val="20"/>
-              </w:rPr>
-              <w:t>print</w:t>
-            </w:r>
-            <w:r>
-              <w:rPr>
-                <w:rFonts w:ascii="Consolas" w:eastAsia="Consolas" w:hAnsi="Consolas"/>
-                <w:color w:val="D6DEE4"/>
-                <w:sz w:val="20"/>
-              </w:rPr>
-              <w:t>(</w:t>
+              <w:t xml:space="preserve"> </w:t>
+            </w:r>
+          </w:p>
+          <w:p>
+            <w:pPr>
+              <w:spacing w:after="0" w:line="259" w:lineRule="auto"/>
+            </w:pPr>
+            <w:r>
+              <w:rPr>
+                <w:rFonts w:ascii="Consolas" w:eastAsia="Consolas" w:hAnsi="Consolas"/>
+                <w:color w:val="D6DEE4"/>
+                <w:sz w:val="20"/>
+              </w:rPr>
+              <w:t xml:space="preserve"> </w:t>
+            </w:r>
+          </w:p>
+          <w:p>
+            <w:pPr>
+              <w:spacing w:after="0" w:line="259" w:lineRule="auto"/>
+            </w:pPr>
+            <w:r>
+              <w:rPr>
+                <w:rFonts w:ascii="Consolas" w:eastAsia="Consolas" w:hAnsi="Consolas"/>
+                <w:color w:val="D6DEE4"/>
+                <w:sz w:val="20"/>
+              </w:rPr>
+              <w:t>sistema = CallCenter()</w:t>
+            </w:r>
+          </w:p>
+          <w:p>
+            <w:pPr>
+              <w:spacing w:after="0" w:line="259" w:lineRule="auto"/>
+            </w:pPr>
+            <w:r>
+              <w:rPr>
+                <w:rFonts w:ascii="Consolas" w:eastAsia="Consolas" w:hAnsi="Consolas"/>
+                <w:color w:val="D6DEE4"/>
+                <w:sz w:val="20"/>
+              </w:rPr>
+              <w:t>sistema.novo_cliente(</w:t>
             </w:r>
             <w:r>
               <w:rPr>
@@ -18084,23 +18207,7 @@
                 <w:color w:val="8FBF7F"/>
                 <w:sz w:val="20"/>
               </w:rPr>
-              <w:t>"-"</w:t>
-            </w:r>
-            <w:r>
-              <w:rPr>
-                <w:rFonts w:ascii="Consolas" w:eastAsia="Consolas" w:hAnsi="Consolas"/>
-                <w:color w:val="D6DEE4"/>
-                <w:sz w:val="20"/>
-              </w:rPr>
-              <w:t xml:space="preserve"> * </w:t>
-            </w:r>
-            <w:r>
-              <w:rPr>
-                <w:rFonts w:ascii="Consolas" w:eastAsia="Consolas" w:hAnsi="Consolas"/>
-                <w:color w:val="D8C072"/>
-                <w:sz w:val="20"/>
-              </w:rPr>
-              <w:t>30</w:t>
+              <w:t>"João"</w:t>
             </w:r>
             <w:r>
               <w:rPr>
@@ -18121,7 +18228,23 @@
                 <w:color w:val="D6DEE4"/>
                 <w:sz w:val="20"/>
               </w:rPr>
-              <w:t xml:space="preserve"> </w:t>
+              <w:t>sistema.novo_cliente(</w:t>
+            </w:r>
+            <w:r>
+              <w:rPr>
+                <w:rFonts w:ascii="Consolas" w:eastAsia="Consolas" w:hAnsi="Consolas"/>
+                <w:color w:val="8FBF7F"/>
+                <w:sz w:val="20"/>
+              </w:rPr>
+              <w:t>"Maria"</w:t>
+            </w:r>
+            <w:r>
+              <w:rPr>
+                <w:rFonts w:ascii="Consolas" w:eastAsia="Consolas" w:hAnsi="Consolas"/>
+                <w:color w:val="D6DEE4"/>
+                <w:sz w:val="20"/>
+              </w:rPr>
+              <w:t>)</w:t>
             </w:r>
           </w:p>
           <w:p>
@@ -18134,91 +18257,15 @@
                 <w:color w:val="D6DEE4"/>
                 <w:sz w:val="20"/>
               </w:rPr>
-              <w:t xml:space="preserve"> </w:t>
-            </w:r>
-          </w:p>
-          <w:p>
-            <w:pPr>
-              <w:spacing w:after="0" w:line="259" w:lineRule="auto"/>
-            </w:pPr>
-            <w:r>
-              <w:rPr>
-                <w:rFonts w:ascii="Consolas" w:eastAsia="Consolas" w:hAnsi="Consolas"/>
-                <w:color w:val="D6DEE4"/>
-                <w:sz w:val="20"/>
-              </w:rPr>
-              <w:t>sistema = CallCenter()</w:t>
-            </w:r>
-          </w:p>
-          <w:p>
-            <w:pPr>
-              <w:spacing w:after="0" w:line="259" w:lineRule="auto"/>
-            </w:pPr>
-            <w:r>
-              <w:rPr>
-                <w:rFonts w:ascii="Consolas" w:eastAsia="Consolas" w:hAnsi="Consolas"/>
-                <w:color w:val="D6DEE4"/>
-                <w:sz w:val="20"/>
-              </w:rPr>
-              <w:t>sistema.novo_cliente(</w:t>
-            </w:r>
-            <w:r>
-              <w:rPr>
-                <w:rFonts w:ascii="Consolas" w:eastAsia="Consolas" w:hAnsi="Consolas"/>
-                <w:color w:val="8FBF7F"/>
-                <w:sz w:val="20"/>
-              </w:rPr>
-              <w:t>"João"</w:t>
-            </w:r>
-            <w:r>
-              <w:rPr>
-                <w:rFonts w:ascii="Consolas" w:eastAsia="Consolas" w:hAnsi="Consolas"/>
-                <w:color w:val="D6DEE4"/>
-                <w:sz w:val="20"/>
-              </w:rPr>
-              <w:t>)</w:t>
-            </w:r>
-          </w:p>
-          <w:p>
-            <w:pPr>
-              <w:spacing w:after="0" w:line="259" w:lineRule="auto"/>
-            </w:pPr>
-            <w:r>
-              <w:rPr>
-                <w:rFonts w:ascii="Consolas" w:eastAsia="Consolas" w:hAnsi="Consolas"/>
-                <w:color w:val="D6DEE4"/>
-                <w:sz w:val="20"/>
-              </w:rPr>
-              <w:t>sistema.novo_cliente(</w:t>
-            </w:r>
-            <w:r>
-              <w:rPr>
-                <w:rFonts w:ascii="Consolas" w:eastAsia="Consolas" w:hAnsi="Consolas"/>
-                <w:color w:val="8FBF7F"/>
-                <w:sz w:val="20"/>
-              </w:rPr>
-              <w:t>"Maria"</w:t>
-            </w:r>
-            <w:r>
-              <w:rPr>
-                <w:rFonts w:ascii="Consolas" w:eastAsia="Consolas" w:hAnsi="Consolas"/>
-                <w:color w:val="D6DEE4"/>
-                <w:sz w:val="20"/>
-              </w:rPr>
-              <w:t>)</w:t>
-            </w:r>
-          </w:p>
-          <w:p>
-            <w:pPr>
-              <w:spacing w:after="0" w:line="259" w:lineRule="auto"/>
-            </w:pPr>
-            <w:r>
-              <w:rPr>
-                <w:rFonts w:ascii="Consolas" w:eastAsia="Consolas" w:hAnsi="Consolas"/>
-                <w:color w:val="D6DEE4"/>
-                <w:sz w:val="20"/>
-              </w:rPr>
-              <w:t>sistema.novo_cliente(</w:t>
+              <w:t>sistema.novo</w:t>
+            </w:r>
+            <w:r>
+              <w:rPr>
+                <w:rFonts w:ascii="Consolas" w:eastAsia="Consolas" w:hAnsi="Consolas"/>
+                <w:color w:val="D6DEE4"/>
+                <w:sz w:val="20"/>
+              </w:rPr>
+              <w:t>_cliente(</w:t>
             </w:r>
             <w:r>
               <w:rPr>
@@ -18418,14 +18465,7 @@
                 <w:rFonts w:eastAsia="Calibri"/>
                 <w:sz w:val="22"/>
               </w:rPr>
-              <w:t>? Se foi erro, a Maria não volta para o fim da fila atrás do Carlos: ela retom</w:t>
-            </w:r>
-            <w:r>
-              <w:rPr>
-                <w:rFonts w:eastAsia="Calibri"/>
-                <w:sz w:val="22"/>
-              </w:rPr>
-              <w:t>a a prioridade de quem já estava sendo atendido.</w:t>
+              <w:t>? Se foi erro, a Maria não volta para o fim da fila atrás do Carlos: ela retoma a prioridade de quem já estava sendo atendido.</w:t>
             </w:r>
           </w:p>
         </w:tc>
@@ -18580,7 +18620,13 @@
         <w:rPr>
           <w:rFonts w:eastAsia="Calibri"/>
         </w:rPr>
-        <w:t>Desfazer o encerramento da Maria e mostrar o painel com ela de volta na frente.</w:t>
+        <w:t xml:space="preserve">Desfazer o encerramento </w:t>
+      </w:r>
+      <w:r>
+        <w:rPr>
+          <w:rFonts w:eastAsia="Calibri"/>
+        </w:rPr>
+        <w:t>da Maria e mostrar o painel com ela de volta na frente.</w:t>
       </w:r>
     </w:p>
     <w:p>
@@ -18676,14 +18722,7 @@
                 <w:rFonts w:eastAsia="Calibri"/>
                 <w:sz w:val="22"/>
               </w:rPr>
-              <w:t>Entender o porquê do hash, ma</w:t>
-            </w:r>
-            <w:r>
-              <w:rPr>
-                <w:rFonts w:eastAsia="Calibri"/>
-                <w:sz w:val="22"/>
-              </w:rPr>
-              <w:t xml:space="preserve">pear chave → índice, tratar colisão por encadeamento e buscar em tempo médio </w:t>
+              <w:t xml:space="preserve">Entender o porquê do hash, mapear chave → índice, tratar colisão por encadeamento e buscar em tempo médio </w:t>
             </w:r>
             <w:r>
               <w:rPr>
@@ -18855,10 +18894,7 @@
               <w:fldChar w:fldCharType="begin"/>
             </w:r>
             <w:r>
-              <w:instrText xml:space="preserve"> PAGEREF s_se_deu</w:instrText>
-            </w:r>
-            <w:r>
-              <w:instrText xml:space="preserve">_erro_faca_isto \h </w:instrText>
+              <w:instrText xml:space="preserve"> PAGEREF s_se_deu_erro_faca_isto \h </w:instrText>
             </w:r>
             <w:r>
               <w:fldChar w:fldCharType="separate"/>
@@ -18904,13 +18940,7 @@
         <w:rPr>
           <w:rFonts w:eastAsia="Calibri"/>
         </w:rPr>
-        <w:t xml:space="preserve"> por índice, mas o índice não é o CPF. Hash transforma a cha</w:t>
-      </w:r>
-      <w:r>
-        <w:rPr>
-          <w:rFonts w:eastAsia="Calibri"/>
-        </w:rPr>
-        <w:t>ve em índice.</w:t>
+        <w:t xml:space="preserve"> por índice, mas o índice não é o CPF. Hash transforma a chave em índice.</w:t>
       </w:r>
     </w:p>
     <w:p>
@@ -18977,7 +19007,13 @@
         <w:rPr>
           <w:rFonts w:eastAsia="Calibri"/>
         </w:rPr>
-        <w:t xml:space="preserve">?” ou “qual o preço do produto </w:t>
+        <w:t>?” ou “q</w:t>
+      </w:r>
+      <w:r>
+        <w:rPr>
+          <w:rFonts w:eastAsia="Calibri"/>
+        </w:rPr>
+        <w:t xml:space="preserve">ual o preço do produto </w:t>
       </w:r>
       <w:r>
         <w:rPr>
@@ -19004,13 +19040,7 @@
         <w:rPr>
           <w:rFonts w:eastAsia="Calibri"/>
         </w:rPr>
-        <w:t xml:space="preserve"> é o índi</w:t>
-      </w:r>
-      <w:r>
-        <w:rPr>
-          <w:rFonts w:eastAsia="Calibri"/>
-        </w:rPr>
-        <w:t xml:space="preserve">ce. Se você só tiver uma lista, precisa percorrer até achar → </w:t>
+        <w:t xml:space="preserve"> é o índice. Se você só tiver uma lista, precisa percorrer até achar → </w:t>
       </w:r>
       <w:r>
         <w:rPr>
@@ -19071,7 +19101,13 @@
         <w:rPr>
           <w:rFonts w:eastAsia="Calibri"/>
         </w:rPr>
-        <w:t xml:space="preserve"> = função que transforma a chave em um número; esse número vira o índice de um “balde” na tabela. Depois disso, você só procura </w:t>
+        <w:t xml:space="preserve"> = função </w:t>
+      </w:r>
+      <w:r>
+        <w:rPr>
+          <w:rFonts w:eastAsia="Calibri"/>
+        </w:rPr>
+        <w:t xml:space="preserve">que transforma a chave em um número; esse número vira o índice de um “balde” na tabela. Depois disso, você só procura </w:t>
       </w:r>
       <w:r>
         <w:rPr>
@@ -19106,7 +19142,13 @@
         <w:rPr>
           <w:rFonts w:eastAsia="Calibri"/>
         </w:rPr>
-        <w:t xml:space="preserve">. O porteiro (função de hash) calcula: “ela mora no andar 2”. Você sobe </w:t>
+        <w:t xml:space="preserve">. O </w:t>
+      </w:r>
+      <w:r>
+        <w:rPr>
+          <w:rFonts w:eastAsia="Calibri"/>
+        </w:rPr>
+        <w:t xml:space="preserve">porteiro (função de hash) calcula: “ela mora no andar 2”. Você sobe </w:t>
       </w:r>
       <w:r>
         <w:rPr>
@@ -19132,13 +19174,7 @@
         <w:rPr>
           <w:rFonts w:eastAsia="Calibri"/>
         </w:rPr>
-        <w:t>. Ainda assim você não vasculha o prédio</w:t>
-      </w:r>
-      <w:r>
-        <w:rPr>
-          <w:rFonts w:eastAsia="Calibri"/>
-        </w:rPr>
-        <w:t xml:space="preserve"> inteiro.</w:t>
+        <w:t>. Ainda assim você não vasculha o prédio inteiro.</w:t>
       </w:r>
     </w:p>
     <w:p>
@@ -19504,7 +19540,13 @@
         <w:rPr>
           <w:rFonts w:eastAsia="Calibri"/>
         </w:rPr>
-        <w:t xml:space="preserve"> — array de tamanho fixo (ex.: 5 ou 8 posições).</w:t>
+        <w:t xml:space="preserve"> — array de tamanho fix</w:t>
+      </w:r>
+      <w:r>
+        <w:rPr>
+          <w:rFonts w:eastAsia="Calibri"/>
+        </w:rPr>
+        <w:t>o (ex.: 5 ou 8 posições).</w:t>
       </w:r>
     </w:p>
     <w:p>
@@ -19694,13 +19736,7 @@
         <w:rPr>
           <w:rFonts w:eastAsia="Calibri"/>
         </w:rPr>
-        <w:t xml:space="preserve"> — dentro do balde guardamos</w:t>
-      </w:r>
-      <w:r>
-        <w:rPr>
-          <w:rFonts w:eastAsia="Calibri"/>
-        </w:rPr>
-        <w:t xml:space="preserve"> </w:t>
+        <w:t xml:space="preserve"> — dentro do balde guardamos </w:t>
       </w:r>
       <w:r>
         <w:rPr>
@@ -19757,7 +19793,15 @@
                 <w:color w:val="D6DEE4"/>
                 <w:sz w:val="20"/>
               </w:rPr>
-              <w:t xml:space="preserve">tamanho = </w:t>
+              <w:t>tamanh</w:t>
+            </w:r>
+            <w:r>
+              <w:rPr>
+                <w:rFonts w:ascii="Consolas" w:eastAsia="Consolas" w:hAnsi="Consolas"/>
+                <w:color w:val="D6DEE4"/>
+                <w:sz w:val="20"/>
+              </w:rPr>
+              <w:t xml:space="preserve">o = </w:t>
             </w:r>
             <w:r>
               <w:rPr>
@@ -20141,15 +20185,7 @@
                 <w:color w:val="D6DEE4"/>
                 <w:sz w:val="20"/>
               </w:rPr>
-              <w:t>, chave)</w:t>
-            </w:r>
-            <w:r>
-              <w:rPr>
-                <w:rFonts w:ascii="Consolas" w:eastAsia="Consolas" w:hAnsi="Consolas"/>
-                <w:color w:val="D6DEE4"/>
-                <w:sz w:val="20"/>
-              </w:rPr>
-              <w:t>:</w:t>
+              <w:t>, chave):</w:t>
             </w:r>
           </w:p>
           <w:p>
@@ -20170,7 +20206,15 @@
                 <w:color w:val="7A8B99"/>
                 <w:sz w:val="20"/>
               </w:rPr>
-              <w:t># didático: soma dos códigos dos caracteres</w:t>
+              <w:t xml:space="preserve"># didático: soma </w:t>
+            </w:r>
+            <w:r>
+              <w:rPr>
+                <w:rFonts w:ascii="Consolas" w:eastAsia="Consolas" w:hAnsi="Consolas"/>
+                <w:color w:val="7A8B99"/>
+                <w:sz w:val="20"/>
+              </w:rPr>
+              <w:t>dos códigos dos caracteres</w:t>
             </w:r>
           </w:p>
           <w:p>
@@ -20416,14 +20460,14 @@
                 <w:rFonts w:eastAsia="Calibri"/>
                 <w:sz w:val="22"/>
               </w:rPr>
-              <w:t xml:space="preserve"> real é mais sofisticada. O que importa agora é o fluxo: chave → núme</w:t>
+              <w:t xml:space="preserve"> real é mais sofisticada. O que importa agora é o fluxo: chave → número → balde → buscar/atu</w:t>
             </w:r>
             <w:r>
               <w:rPr>
                 <w:rFonts w:eastAsia="Calibri"/>
                 <w:sz w:val="22"/>
               </w:rPr>
-              <w:t>ro → balde → buscar/atualizar.</w:t>
+              <w:t>alizar.</w:t>
             </w:r>
           </w:p>
         </w:tc>
@@ -20749,13 +20793,7 @@
         <w:rPr>
           <w:rFonts w:eastAsia="Calibri"/>
         </w:rPr>
-        <w:t>Percor</w:t>
-      </w:r>
-      <w:r>
-        <w:rPr>
-          <w:rFonts w:eastAsia="Calibri"/>
-        </w:rPr>
-        <w:t xml:space="preserve">rer </w:t>
+        <w:t xml:space="preserve">Percorrer </w:t>
       </w:r>
       <w:r>
         <w:rPr>
@@ -20781,7 +20819,15 @@
           <w:b/>
           <w:color w:val="C46B3A"/>
         </w:rPr>
-        <w:t xml:space="preserve">Passo 3. </w:t>
+        <w:t>Pass</w:t>
+      </w:r>
+      <w:r>
+        <w:rPr>
+          <w:rFonts w:ascii="Trebuchet MS" w:eastAsia="Trebuchet MS" w:hAnsi="Trebuchet MS"/>
+          <w:b/>
+          <w:color w:val="C46B3A"/>
+        </w:rPr>
+        <w:t xml:space="preserve">o 3. </w:t>
       </w:r>
       <w:r>
         <w:rPr>
@@ -21067,14 +21113,7 @@
                 <w:rFonts w:eastAsia="Calibri"/>
                 <w:sz w:val="22"/>
               </w:rPr>
-              <w:t xml:space="preserve"> tabela folgada e hash espa</w:t>
-            </w:r>
-            <w:r>
-              <w:rPr>
-                <w:rFonts w:eastAsia="Calibri"/>
-                <w:sz w:val="22"/>
-              </w:rPr>
-              <w:t>lhada.</w:t>
+              <w:t xml:space="preserve"> tabela folgada e hash espalhada.</w:t>
             </w:r>
           </w:p>
         </w:tc>
@@ -21094,7 +21133,16 @@
           <w:color w:val="1A6B64"/>
           <w:sz w:val="30"/>
         </w:rPr>
-        <w:t>Comparação rápida (não misture com as outras aulas)</w:t>
+        <w:t>Comparação rápida (não misture com as outras aula</w:t>
+      </w:r>
+      <w:r>
+        <w:rPr>
+          <w:rFonts w:ascii="Trebuchet MS" w:eastAsia="Trebuchet MS" w:hAnsi="Trebuchet MS"/>
+          <w:b/>
+          <w:color w:val="1A6B64"/>
+          <w:sz w:val="30"/>
+        </w:rPr>
+        <w:t>s)</w:t>
       </w:r>
       <w:bookmarkEnd w:id="44"/>
     </w:p>
@@ -21271,7 +21319,13 @@
         <w:rPr>
           <w:rFonts w:eastAsia="Calibri"/>
         </w:rPr>
-        <w:t>; mais complexa.</w:t>
+        <w:t xml:space="preserve">; mais </w:t>
+      </w:r>
+      <w:r>
+        <w:rPr>
+          <w:rFonts w:eastAsia="Calibri"/>
+        </w:rPr>
+        <w:t>complexa.</w:t>
       </w:r>
     </w:p>
     <w:p>
@@ -21322,16 +21376,7 @@
           <w:color w:val="1A6B64"/>
           <w:sz w:val="30"/>
         </w:rPr>
-        <w:t xml:space="preserve">Exercício na </w:t>
-      </w:r>
-      <w:r>
-        <w:rPr>
-          <w:rFonts w:ascii="Trebuchet MS" w:eastAsia="Trebuchet MS" w:hAnsi="Trebuchet MS"/>
-          <w:b/>
-          <w:color w:val="1A6B64"/>
-          <w:sz w:val="30"/>
-        </w:rPr>
-        <w:t>mão (antes do código)</w:t>
+        <w:t>Exercício na mão (antes do código)</w:t>
       </w:r>
       <w:bookmarkEnd w:id="45"/>
     </w:p>
@@ -21354,7 +21399,13 @@
         <w:rPr>
           <w:rFonts w:eastAsia="Calibri"/>
         </w:rPr>
-        <w:t xml:space="preserve"> e a função do curso: </w:t>
+        <w:t xml:space="preserve"> e a funçã</w:t>
+      </w:r>
+      <w:r>
+        <w:rPr>
+          <w:rFonts w:eastAsia="Calibri"/>
+        </w:rPr>
+        <w:t xml:space="preserve">o do curso: </w:t>
       </w:r>
       <w:r>
         <w:rPr>
@@ -21419,13 +21470,7 @@
         <w:rPr>
           <w:rFonts w:eastAsia="Calibri"/>
         </w:rPr>
-        <w:t xml:space="preserve"> no glossário). Códi</w:t>
-      </w:r>
-      <w:r>
-        <w:rPr>
-          <w:rFonts w:eastAsia="Calibri"/>
-        </w:rPr>
-        <w:t xml:space="preserve">gos úteis: </w:t>
+        <w:t xml:space="preserve"> no glossário). Códigos úteis: </w:t>
       </w:r>
       <w:r>
         <w:rPr>
@@ -21554,7 +21599,16 @@
                 <w:sz w:val="22"/>
               </w:rPr>
               <w:lastRenderedPageBreak/>
-              <w:t>Parte A — Calcular índices</w:t>
+              <w:t>Parte A</w:t>
+            </w:r>
+            <w:r>
+              <w:rPr>
+                <w:rFonts w:ascii="Trebuchet MS" w:eastAsia="Trebuchet MS" w:hAnsi="Trebuchet MS"/>
+                <w:b/>
+                <w:color w:val="0E2438"/>
+                <w:sz w:val="22"/>
+              </w:rPr>
+              <w:t xml:space="preserve"> — Calcular índices</w:t>
             </w:r>
           </w:p>
           <w:p>
@@ -21716,14 +21770,7 @@
                 <w:rFonts w:eastAsia="Calibri"/>
                 <w:sz w:val="22"/>
               </w:rPr>
-              <w:t xml:space="preserve">. Desenhe os </w:t>
-            </w:r>
-            <w:r>
-              <w:rPr>
-                <w:rFonts w:eastAsia="Calibri"/>
-                <w:sz w:val="22"/>
-              </w:rPr>
-              <w:t>5 baldes e o conteúdo de cada um.</w:t>
+              <w:t>. Desenhe os 5 baldes e o conteúdo de cada um.</w:t>
             </w:r>
           </w:p>
         </w:tc>
@@ -21771,7 +21818,16 @@
                 <w:color w:val="0E2438"/>
                 <w:sz w:val="22"/>
               </w:rPr>
-              <w:t>Parte C — Forçar colisão</w:t>
+              <w:t xml:space="preserve">Parte C — Forçar </w:t>
+            </w:r>
+            <w:r>
+              <w:rPr>
+                <w:rFonts w:ascii="Trebuchet MS" w:eastAsia="Trebuchet MS" w:hAnsi="Trebuchet MS"/>
+                <w:b/>
+                <w:color w:val="0E2438"/>
+                <w:sz w:val="22"/>
+              </w:rPr>
+              <w:t>colisão</w:t>
             </w:r>
           </w:p>
           <w:p>
@@ -21888,7 +21944,14 @@
                 <w:rFonts w:eastAsia="Calibri"/>
                 <w:sz w:val="22"/>
               </w:rPr>
-              <w:t xml:space="preserve">, quantos baldes você abre? 2) Se o balde tiver 2 pares, o que você compara? 3) Se o tamanho da tabela for </w:t>
+              <w:t>, quantos</w:t>
+            </w:r>
+            <w:r>
+              <w:rPr>
+                <w:rFonts w:eastAsia="Calibri"/>
+                <w:sz w:val="22"/>
+              </w:rPr>
+              <w:t xml:space="preserve"> baldes você abre? 2) Se o balde tiver 2 pares, o que você compara? 3) Se o tamanho da tabela for </w:t>
             </w:r>
             <w:r>
               <w:rPr>
@@ -21978,14 +22041,7 @@
                 <w:rFonts w:eastAsia="Calibri"/>
                 <w:sz w:val="22"/>
               </w:rPr>
-              <w:t xml:space="preserve"> de tentar no papel</w:t>
-            </w:r>
-            <w:r>
-              <w:rPr>
-                <w:rFonts w:eastAsia="Calibri"/>
-                <w:sz w:val="22"/>
-              </w:rPr>
-              <w:t>.</w:t>
+              <w:t xml:space="preserve"> de tentar no papel.</w:t>
             </w:r>
           </w:p>
         </w:tc>
@@ -22741,15 +22797,7 @@
                 <w:color w:val="D6DEE4"/>
                 <w:sz w:val="20"/>
               </w:rPr>
-              <w:t>.baldes[indice].</w:t>
-            </w:r>
-            <w:r>
-              <w:rPr>
-                <w:rFonts w:ascii="Consolas" w:eastAsia="Consolas" w:hAnsi="Consolas"/>
-                <w:color w:val="D6DEE4"/>
-                <w:sz w:val="20"/>
-              </w:rPr>
-              <w:t>append([chave, valor])</w:t>
+              <w:t>.baldes[indice].append([chave, valor])</w:t>
             </w:r>
           </w:p>
           <w:p>
@@ -23109,15 +23157,7 @@
                 <w:color w:val="D6DEE4"/>
                 <w:sz w:val="20"/>
               </w:rPr>
-              <w:t>catalogo.inserir</w:t>
-            </w:r>
-            <w:r>
-              <w:rPr>
-                <w:rFonts w:ascii="Consolas" w:eastAsia="Consolas" w:hAnsi="Consolas"/>
-                <w:color w:val="D6DEE4"/>
-                <w:sz w:val="20"/>
-              </w:rPr>
-              <w:t>(</w:t>
+              <w:t>catalogo.inserir(</w:t>
             </w:r>
             <w:r>
               <w:rPr>
@@ -23162,7 +23202,15 @@
                 <w:color w:val="D6DEE4"/>
                 <w:sz w:val="20"/>
               </w:rPr>
-              <w:t>catalogo.inserir(</w:t>
+              <w:t>catalogo.</w:t>
+            </w:r>
+            <w:r>
+              <w:rPr>
+                <w:rFonts w:ascii="Consolas" w:eastAsia="Consolas" w:hAnsi="Consolas"/>
+                <w:color w:val="D6DEE4"/>
+                <w:sz w:val="20"/>
+              </w:rPr>
+              <w:t>inserir(</w:t>
             </w:r>
             <w:r>
               <w:rPr>
@@ -23360,14 +23408,14 @@
                 <w:rFonts w:eastAsia="Calibri"/>
                 <w:sz w:val="22"/>
               </w:rPr>
-              <w:t xml:space="preserve">Ao inserir, primeiro percorra o balde: se a chave já existe, atualize o valor. Senão a </w:t>
+              <w:t>Ao inserir, primeiro percorra o balde: se a chave já existe, atualize o valor. Senão a mesma chave aparece duas vezes e</w:t>
             </w:r>
             <w:r>
               <w:rPr>
                 <w:rFonts w:eastAsia="Calibri"/>
                 <w:sz w:val="22"/>
               </w:rPr>
-              <w:t>mesma chave aparece duas vezes e a busca pega a antiga.</w:t>
+              <w:t xml:space="preserve"> a busca pega a antiga.</w:t>
             </w:r>
           </w:p>
         </w:tc>
@@ -23489,14 +23537,14 @@
                 <w:rFonts w:eastAsia="Calibri"/>
                 <w:sz w:val="22"/>
               </w:rPr>
-              <w:t xml:space="preserve"> </w:t>
+              <w:t xml:space="preserve"> após cada inserção, force uma co</w:t>
             </w:r>
             <w:r>
               <w:rPr>
                 <w:rFonts w:eastAsia="Calibri"/>
                 <w:sz w:val="22"/>
               </w:rPr>
-              <w:t xml:space="preserve">após cada inserção, force uma colisão e mostre os dois pares no mesmo balde. Explique em voz alta o que </w:t>
+              <w:t xml:space="preserve">lisão e mostre os dois pares no mesmo balde. Explique em voz alta o que </w:t>
             </w:r>
             <w:r>
               <w:rPr>
@@ -23803,16 +23851,7 @@
           <w:color w:val="0E2438"/>
           <w:sz w:val="44"/>
         </w:rPr>
-        <w:t>Árvores Binárias e Árvores de Busca</w:t>
-      </w:r>
-      <w:r>
-        <w:rPr>
-          <w:rFonts w:ascii="Trebuchet MS" w:eastAsia="Trebuchet MS" w:hAnsi="Trebuchet MS"/>
-          <w:b/>
-          <w:color w:val="0E2438"/>
-          <w:sz w:val="44"/>
-        </w:rPr>
-        <w:t xml:space="preserve"> (BST)</w:t>
+        <w:t>Árvores Binárias e Árvores de Busca (BST)</w:t>
       </w:r>
       <w:bookmarkEnd w:id="48"/>
     </w:p>
@@ -23869,7 +23908,14 @@
                 <w:rFonts w:eastAsia="Calibri"/>
                 <w:sz w:val="22"/>
               </w:rPr>
-              <w:t>Montar uma BST pela regra esquerda/direita, ver o nó de verdade, inserir o 35, reconhecer quando a árvore pende e equilibrar com as fórmulas AVL e os quatro casos de rotação — sem exigir uma AVL completa no projeto.</w:t>
+              <w:t>Mont</w:t>
+            </w:r>
+            <w:r>
+              <w:rPr>
+                <w:rFonts w:eastAsia="Calibri"/>
+                <w:sz w:val="22"/>
+              </w:rPr>
+              <w:t>ar uma BST pela regra esquerda/direita, ver o nó de verdade, inserir o 35, reconhecer quando a árvore pende e equilibrar com as fórmulas AVL e os quatro casos de rotação — sem exigir uma AVL completa no projeto.</w:t>
             </w:r>
           </w:p>
         </w:tc>
@@ -23917,16 +23963,7 @@
                 <w:color w:val="0E2438"/>
                 <w:sz w:val="22"/>
               </w:rPr>
-              <w:t>Para</w:t>
-            </w:r>
-            <w:r>
-              <w:rPr>
-                <w:rFonts w:ascii="Trebuchet MS" w:eastAsia="Trebuchet MS" w:hAnsi="Trebuchet MS"/>
-                <w:b/>
-                <w:color w:val="0E2438"/>
-                <w:sz w:val="22"/>
-              </w:rPr>
-              <w:t xml:space="preserve"> seguir, use o VS Code</w:t>
+              <w:t>Para seguir, use o VS Code</w:t>
             </w:r>
           </w:p>
           <w:p>
@@ -23938,7 +23975,14 @@
                 <w:rFonts w:eastAsia="Calibri"/>
                 <w:sz w:val="22"/>
               </w:rPr>
-              <w:t xml:space="preserve">A instalação não entra no tempo de aula. Se ainda não tiver o programa, faça o passo a passo em </w:t>
+              <w:t>A instalação nã</w:t>
+            </w:r>
+            <w:r>
+              <w:rPr>
+                <w:rFonts w:eastAsia="Calibri"/>
+                <w:sz w:val="22"/>
+              </w:rPr>
+              <w:t xml:space="preserve">o entra no tempo de aula. Se ainda não tiver o programa, faça o passo a passo em </w:t>
             </w:r>
             <w:hyperlink w:anchor="s_instalacao_fazer_em_casa_nao_en_38f464" w:history="1">
               <w:r>
@@ -37888,7 +37932,7 @@
         <w:spacing w:before="320" w:line="283" w:lineRule="auto"/>
         <w:outlineLvl w:val="1"/>
       </w:pPr>
-      <w:bookmarkStart w:id="69" w:name="s_praticas_da_aula_6"/>
+      <w:bookmarkStart w:id="69" w:name="s_extrair_a_raiz_um_de_cada_vez"/>
       <w:r>
         <w:rPr>
           <w:rFonts w:ascii="Trebuchet MS" w:eastAsia="Trebuchet MS" w:hAnsi="Trebuchet MS"/>
@@ -37896,9 +37940,336 @@
           <w:color w:val="1A6B64"/>
           <w:sz w:val="30"/>
         </w:rPr>
+        <w:t>Extrair a raiz, um de cada vez</w:t>
+      </w:r>
+      <w:bookmarkEnd w:id="69"/>
+    </w:p>
+    <w:p>
+      <w:r>
+        <w:rPr>
+          <w:rFonts w:eastAsia="Calibri"/>
+        </w:rPr>
+        <w:t>Ler o array da esquerda para a direita não é a ordem de saída. A lista [8, 6, 7,</w:t>
+      </w:r>
+      <w:r>
+        <w:rPr>
+          <w:rFonts w:eastAsia="Calibri"/>
+        </w:rPr>
+        <w:t xml:space="preserve"> 1, 3, 4, 2] já é uma max-heap: pai ≥ filhos, e o maior está no índice 0. No código desta aula a comparação é a inversa (min-heap). A casa que muda é a mesma.</w:t>
+      </w:r>
+    </w:p>
+    <w:p>
+      <w:r>
+        <w:rPr>
+          <w:rFonts w:eastAsia="Calibri"/>
+        </w:rPr>
+        <w:t xml:space="preserve">Ao tirar a raiz, o último índice ocupa o índice 0 e a lista encolhe no fim. Esse valor troca com </w:t>
+      </w:r>
+      <w:r>
+        <w:rPr>
+          <w:rFonts w:eastAsia="Calibri"/>
+        </w:rPr>
+        <w:t>o filho maior (</w:t>
+      </w:r>
+      <w:r>
+        <w:rPr>
+          <w:rFonts w:ascii="Consolas" w:eastAsia="Consolas" w:hAnsi="Consolas"/>
+          <w:color w:val="1A6B64"/>
+          <w:sz w:val="22"/>
+        </w:rPr>
+        <w:t>2*i+1</w:t>
+      </w:r>
+      <w:r>
+        <w:rPr>
+          <w:rFonts w:eastAsia="Calibri"/>
+        </w:rPr>
+        <w:t xml:space="preserve"> ou </w:t>
+      </w:r>
+      <w:r>
+        <w:rPr>
+          <w:rFonts w:ascii="Consolas" w:eastAsia="Consolas" w:hAnsi="Consolas"/>
+          <w:color w:val="1A6B64"/>
+          <w:sz w:val="22"/>
+        </w:rPr>
+        <w:t>2*i+2</w:t>
+      </w:r>
+      <w:r>
+        <w:rPr>
+          <w:rFonts w:eastAsia="Calibri"/>
+        </w:rPr>
+        <w:t>) enquanto o filho for maior. Os outros índices ficam parados. Não é um escorregão para a casa vizinha.</w:t>
+      </w:r>
+    </w:p>
+    <w:p>
+      <w:pPr>
+        <w:spacing w:before="160" w:after="80" w:line="283" w:lineRule="auto"/>
+        <w:jc w:val="center"/>
+      </w:pPr>
+      <w:r>
+        <w:rPr>
+          <w:noProof/>
+        </w:rPr>
+        <w:drawing>
+          <wp:inline distT="0" distB="0" distL="0" distR="0">
+            <wp:extent cx="5472000" cy="2970514"/>
+            <wp:effectExtent l="0" t="0" r="0" b="0"/>
+            <wp:docPr id="24" name="Picture 24"/>
+            <wp:cNvGraphicFramePr>
+              <a:graphicFrameLocks xmlns:a="http://schemas.openxmlformats.org/drawingml/2006/main" noChangeAspect="1"/>
+            </wp:cNvGraphicFramePr>
+            <a:graphic xmlns:a="http://schemas.openxmlformats.org/drawingml/2006/main">
+              <a:graphicData uri="http://schemas.openxmlformats.org/drawingml/2006/picture">
+                <pic:pic xmlns:pic="http://schemas.openxmlformats.org/drawingml/2006/picture">
+                  <pic:nvPicPr>
+                    <pic:cNvPr id="0" name="07_heap_passo_1.png"/>
+                    <pic:cNvPicPr/>
+                  </pic:nvPicPr>
+                  <pic:blipFill>
+                    <a:blip r:embed="rId31"/>
+                    <a:stretch>
+                      <a:fillRect/>
+                    </a:stretch>
+                  </pic:blipFill>
+                  <pic:spPr>
+                    <a:xfrm>
+                      <a:off x="0" y="0"/>
+                      <a:ext cx="5472000" cy="2970514"/>
+                    </a:xfrm>
+                    <a:prstGeom prst="rect">
+                      <a:avLst/>
+                    </a:prstGeom>
+                  </pic:spPr>
+                </pic:pic>
+              </a:graphicData>
+            </a:graphic>
+          </wp:inline>
+        </w:drawing>
+      </w:r>
+    </w:p>
+    <w:p>
+      <w:pPr>
+        <w:spacing w:after="200" w:line="283" w:lineRule="auto"/>
+        <w:jc w:val="center"/>
+      </w:pPr>
+      <w:r>
+        <w:rPr>
+          <w:rFonts w:eastAsia="Calibri"/>
+          <w:i/>
+          <w:color w:val="5C5C5C"/>
+          <w:sz w:val="18"/>
+        </w:rPr>
+        <w:t>1. A raiz é 8. O 4 está debaixo do 7, no índice 5.</w:t>
+      </w:r>
+    </w:p>
+    <w:p>
+      <w:pPr>
+        <w:spacing w:before="160" w:after="80" w:line="283" w:lineRule="auto"/>
+        <w:jc w:val="center"/>
+      </w:pPr>
+      <w:r>
+        <w:rPr>
+          <w:noProof/>
+        </w:rPr>
+        <w:drawing>
+          <wp:inline distT="0" distB="0" distL="0" distR="0">
+            <wp:extent cx="5472000" cy="2970514"/>
+            <wp:effectExtent l="0" t="0" r="0" b="0"/>
+            <wp:docPr id="25" name="Picture 25"/>
+            <wp:cNvGraphicFramePr>
+              <a:graphicFrameLocks xmlns:a="http://schemas.openxmlformats.org/drawingml/2006/main" noChangeAspect="1"/>
+            </wp:cNvGraphicFramePr>
+            <a:graphic xmlns:a="http://schemas.openxmlformats.org/drawingml/2006/main">
+              <a:graphicData uri="http://schemas.openxmlformats.org/drawingml/2006/picture">
+                <pic:pic xmlns:pic="http://schemas.openxmlformats.org/drawingml/2006/picture">
+                  <pic:nvPicPr>
+                    <pic:cNvPr id="0" name="07_heap_passo_2.png"/>
+                    <pic:cNvPicPr/>
+                  </pic:nvPicPr>
+                  <pic:blipFill>
+                    <a:blip r:embed="rId32"/>
+                    <a:stretch>
+                      <a:fillRect/>
+                    </a:stretch>
+                  </pic:blipFill>
+                  <pic:spPr>
+                    <a:xfrm>
+                      <a:off x="0" y="0"/>
+                      <a:ext cx="5472000" cy="2970514"/>
+                    </a:xfrm>
+                    <a:prstGeom prst="rect">
+                      <a:avLst/>
+                    </a:prstGeom>
+                  </pic:spPr>
+                </pic:pic>
+              </a:graphicData>
+            </a:graphic>
+          </wp:inline>
+        </w:drawing>
+      </w:r>
+    </w:p>
+    <w:p>
+      <w:pPr>
+        <w:spacing w:after="200" w:line="283" w:lineRule="auto"/>
+        <w:jc w:val="center"/>
+      </w:pPr>
+      <w:r>
+        <w:rPr>
+          <w:rFonts w:eastAsia="Calibri"/>
+          <w:i/>
+          <w:color w:val="5C5C5C"/>
+          <w:sz w:val="18"/>
+        </w:rPr>
+        <w:lastRenderedPageBreak/>
+        <w:t xml:space="preserve">2. Saiu o 8. O 2 foi para o índice 0, trocou com o 7 e depois com o </w:t>
+      </w:r>
+      <w:r>
+        <w:rPr>
+          <w:rFonts w:eastAsia="Calibri"/>
+          <w:i/>
+          <w:color w:val="5C5C5C"/>
+          <w:sz w:val="18"/>
+        </w:rPr>
+        <w:t>4. Nova raiz: 7.</w:t>
+      </w:r>
+    </w:p>
+    <w:p>
+      <w:pPr>
+        <w:spacing w:before="160" w:after="80" w:line="283" w:lineRule="auto"/>
+        <w:jc w:val="center"/>
+      </w:pPr>
+      <w:r>
+        <w:rPr>
+          <w:noProof/>
+        </w:rPr>
+        <w:drawing>
+          <wp:inline distT="0" distB="0" distL="0" distR="0">
+            <wp:extent cx="5472000" cy="2970514"/>
+            <wp:effectExtent l="0" t="0" r="0" b="0"/>
+            <wp:docPr id="26" name="Picture 26"/>
+            <wp:cNvGraphicFramePr>
+              <a:graphicFrameLocks xmlns:a="http://schemas.openxmlformats.org/drawingml/2006/main" noChangeAspect="1"/>
+            </wp:cNvGraphicFramePr>
+            <a:graphic xmlns:a="http://schemas.openxmlformats.org/drawingml/2006/main">
+              <a:graphicData uri="http://schemas.openxmlformats.org/drawingml/2006/picture">
+                <pic:pic xmlns:pic="http://schemas.openxmlformats.org/drawingml/2006/picture">
+                  <pic:nvPicPr>
+                    <pic:cNvPr id="0" name="07_heap_passo_3.png"/>
+                    <pic:cNvPicPr/>
+                  </pic:nvPicPr>
+                  <pic:blipFill>
+                    <a:blip r:embed="rId33"/>
+                    <a:stretch>
+                      <a:fillRect/>
+                    </a:stretch>
+                  </pic:blipFill>
+                  <pic:spPr>
+                    <a:xfrm>
+                      <a:off x="0" y="0"/>
+                      <a:ext cx="5472000" cy="2970514"/>
+                    </a:xfrm>
+                    <a:prstGeom prst="rect">
+                      <a:avLst/>
+                    </a:prstGeom>
+                  </pic:spPr>
+                </pic:pic>
+              </a:graphicData>
+            </a:graphic>
+          </wp:inline>
+        </w:drawing>
+      </w:r>
+    </w:p>
+    <w:p>
+      <w:pPr>
+        <w:spacing w:after="200" w:line="283" w:lineRule="auto"/>
+        <w:jc w:val="center"/>
+      </w:pPr>
+      <w:r>
+        <w:rPr>
+          <w:rFonts w:eastAsia="Calibri"/>
+          <w:i/>
+          <w:color w:val="5C5C5C"/>
+          <w:sz w:val="18"/>
+        </w:rPr>
+        <w:t>3. Saiu o 7. O 2 trocou com o 6 e depois com o 3. O 4 continua à direita. Nova raiz: 6.</w:t>
+      </w:r>
+    </w:p>
+    <w:p>
+      <w:pPr>
+        <w:spacing w:before="160" w:after="80" w:line="283" w:lineRule="auto"/>
+        <w:jc w:val="center"/>
+      </w:pPr>
+      <w:r>
+        <w:rPr>
+          <w:noProof/>
+        </w:rPr>
+        <w:drawing>
+          <wp:inline distT="0" distB="0" distL="0" distR="0">
+            <wp:extent cx="5472000" cy="2970514"/>
+            <wp:effectExtent l="0" t="0" r="0" b="0"/>
+            <wp:docPr id="27" name="Picture 27"/>
+            <wp:cNvGraphicFramePr>
+              <a:graphicFrameLocks xmlns:a="http://schemas.openxmlformats.org/drawingml/2006/main" noChangeAspect="1"/>
+            </wp:cNvGraphicFramePr>
+            <a:graphic xmlns:a="http://schemas.openxmlformats.org/drawingml/2006/main">
+              <a:graphicData uri="http://schemas.openxmlformats.org/drawingml/2006/picture">
+                <pic:pic xmlns:pic="http://schemas.openxmlformats.org/drawingml/2006/picture">
+                  <pic:nvPicPr>
+                    <pic:cNvPr id="0" name="07_heap_passo_4.png"/>
+                    <pic:cNvPicPr/>
+                  </pic:nvPicPr>
+                  <pic:blipFill>
+                    <a:blip r:embed="rId34"/>
+                    <a:stretch>
+                      <a:fillRect/>
+                    </a:stretch>
+                  </pic:blipFill>
+                  <pic:spPr>
+                    <a:xfrm>
+                      <a:off x="0" y="0"/>
+                      <a:ext cx="5472000" cy="2970514"/>
+                    </a:xfrm>
+                    <a:prstGeom prst="rect">
+                      <a:avLst/>
+                    </a:prstGeom>
+                  </pic:spPr>
+                </pic:pic>
+              </a:graphicData>
+            </a:graphic>
+          </wp:inline>
+        </w:drawing>
+      </w:r>
+    </w:p>
+    <w:p>
+      <w:pPr>
+        <w:spacing w:after="200" w:line="283" w:lineRule="auto"/>
+        <w:jc w:val="center"/>
+      </w:pPr>
+      <w:r>
+        <w:rPr>
+          <w:rFonts w:eastAsia="Calibri"/>
+          <w:i/>
+          <w:color w:val="5C5C5C"/>
+          <w:sz w:val="18"/>
+        </w:rPr>
+        <w:t>4. Saiu o 6. O 4 sobe do índice 2 para o 0 e vira a raiz. A ordem de saída foi 8, 7, 6, 4.</w:t>
+      </w:r>
+    </w:p>
+    <w:p>
+      <w:pPr>
+        <w:spacing w:before="320" w:line="283" w:lineRule="auto"/>
+        <w:outlineLvl w:val="1"/>
+      </w:pPr>
+      <w:bookmarkStart w:id="70" w:name="s_praticas_da_aula_6"/>
+      <w:r>
+        <w:rPr>
+          <w:rFonts w:ascii="Trebuchet MS" w:eastAsia="Trebuchet MS" w:hAnsi="Trebuchet MS"/>
+          <w:b/>
+          <w:color w:val="1A6B64"/>
+          <w:sz w:val="30"/>
+        </w:rPr>
         <w:t>Práticas da aula</w:t>
       </w:r>
-      <w:bookmarkEnd w:id="69"/>
+      <w:bookmarkEnd w:id="70"/>
     </w:p>
     <w:tbl>
       <w:tblPr>
@@ -37953,7 +38324,14 @@
                 <w:rFonts w:eastAsia="Calibri"/>
                 <w:sz w:val="22"/>
               </w:rPr>
-              <w:t xml:space="preserve">Pacientes entram com um número de gravidade. Quem tem o menor número (mais crítico) sai primeiro, mesmo tendo chegado depois. Use o heap. O contador </w:t>
+              <w:t xml:space="preserve">Pacientes </w:t>
+            </w:r>
+            <w:r>
+              <w:rPr>
+                <w:rFonts w:eastAsia="Calibri"/>
+                <w:sz w:val="22"/>
+              </w:rPr>
+              <w:t xml:space="preserve">entram com um número de gravidade. Quem tem o menor número (mais crítico) sai primeiro, mesmo tendo chegado depois. Use o heap. O contador </w:t>
             </w:r>
             <w:r>
               <w:rPr>
@@ -38127,6 +38505,7 @@
                 <w:color w:val="D6DEE4"/>
                 <w:sz w:val="20"/>
               </w:rPr>
+              <w:lastRenderedPageBreak/>
               <w:t xml:space="preserve">        </w:t>
             </w:r>
             <w:r>
@@ -38349,7 +38728,15 @@
                 <w:color w:val="D6DEE4"/>
                 <w:sz w:val="20"/>
               </w:rPr>
-              <w:t xml:space="preserve">.ordem += </w:t>
+              <w:t>.ordem</w:t>
+            </w:r>
+            <w:r>
+              <w:rPr>
+                <w:rFonts w:ascii="Consolas" w:eastAsia="Consolas" w:hAnsi="Consolas"/>
+                <w:color w:val="D6DEE4"/>
+                <w:sz w:val="20"/>
+              </w:rPr>
+              <w:t xml:space="preserve"> += </w:t>
             </w:r>
             <w:r>
               <w:rPr>
@@ -38626,7 +39013,15 @@
                 <w:color w:val="8FBF7F"/>
                 <w:sz w:val="20"/>
               </w:rPr>
-              <w:t>"Paciente leve"</w:t>
+              <w:t xml:space="preserve">"Paciente </w:t>
+            </w:r>
+            <w:r>
+              <w:rPr>
+                <w:rFonts w:ascii="Consolas" w:eastAsia="Consolas" w:hAnsi="Consolas"/>
+                <w:color w:val="8FBF7F"/>
+                <w:sz w:val="20"/>
+              </w:rPr>
+              <w:t>leve"</w:t>
             </w:r>
             <w:r>
               <w:rPr>
@@ -38762,7 +39157,7 @@
         <w:spacing w:before="320" w:line="283" w:lineRule="auto"/>
         <w:outlineLvl w:val="1"/>
       </w:pPr>
-      <w:bookmarkStart w:id="70" w:name="s_briefing_do_projeto_final"/>
+      <w:bookmarkStart w:id="71" w:name="s_briefing_do_projeto_final"/>
       <w:r>
         <w:rPr>
           <w:rFonts w:ascii="Trebuchet MS" w:eastAsia="Trebuchet MS" w:hAnsi="Trebuchet MS"/>
@@ -38772,7 +39167,7 @@
         </w:rPr>
         <w:t>Briefing do Projeto Final</w:t>
       </w:r>
-      <w:bookmarkEnd w:id="70"/>
+      <w:bookmarkEnd w:id="71"/>
     </w:p>
     <w:p>
       <w:r>
@@ -38809,13 +39204,13 @@
         <w:rPr>
           <w:rFonts w:eastAsia="Calibri"/>
         </w:rPr>
-        <w:t xml:space="preserve">Grafo — mapa de </w:t>
-      </w:r>
-      <w:r>
-        <w:rPr>
-          <w:rFonts w:eastAsia="Calibri"/>
-        </w:rPr>
-        <w:t>bairros / pontos de entrega (BFS para o caminho).</w:t>
+        <w:t xml:space="preserve">Grafo — mapa de bairros / </w:t>
+      </w:r>
+      <w:r>
+        <w:rPr>
+          <w:rFonts w:eastAsia="Calibri"/>
+        </w:rPr>
+        <w:t>pontos de entrega (BFS para o caminho).</w:t>
       </w:r>
     </w:p>
     <w:p>
@@ -38975,15 +39370,14 @@
                 <w:rFonts w:eastAsia="Calibri"/>
                 <w:sz w:val="22"/>
               </w:rPr>
-              <w:lastRenderedPageBreak/>
-              <w:t xml:space="preserve">Quem chegar </w:t>
+              <w:t xml:space="preserve">Quem chegar na Aula 8 </w:t>
             </w:r>
             <w:r>
               <w:rPr>
                 <w:rFonts w:eastAsia="Calibri"/>
                 <w:sz w:val="22"/>
               </w:rPr>
-              <w:t>na Aula 8 sem hash, grafo e heap vai sofrer. Feche as práticas 4, 6 e 7. Não recomece do zero na apresentação.</w:t>
+              <w:t>sem hash, grafo e heap vai sofrer. Feche as práticas 4, 6 e 7. Não recomece do zero na apresentação.</w:t>
             </w:r>
           </w:p>
         </w:tc>
@@ -39060,13 +39454,13 @@
         <w:rPr>
           <w:rFonts w:eastAsia="Calibri"/>
         </w:rPr>
-        <w:t>Atender o paciente crítico</w:t>
-      </w:r>
-      <w:r>
-        <w:rPr>
-          <w:rFonts w:eastAsia="Calibri"/>
-        </w:rPr>
-        <w:t xml:space="preserve"> antes do leve.</w:t>
+        <w:t xml:space="preserve">Atender o paciente crítico antes do </w:t>
+      </w:r>
+      <w:r>
+        <w:rPr>
+          <w:rFonts w:eastAsia="Calibri"/>
+        </w:rPr>
+        <w:t>leve.</w:t>
       </w:r>
     </w:p>
     <w:p>
@@ -39127,7 +39521,7 @@
         <w:spacing w:after="240" w:line="283" w:lineRule="auto"/>
         <w:outlineLvl w:val="0"/>
       </w:pPr>
-      <w:bookmarkStart w:id="71" w:name="s_aula_8_projeto_final_pbl_integrado"/>
+      <w:bookmarkStart w:id="72" w:name="s_aula_8_projeto_final_pbl_integrado"/>
       <w:r>
         <w:rPr>
           <w:rFonts w:ascii="Trebuchet MS" w:eastAsia="Trebuchet MS" w:hAnsi="Trebuchet MS"/>
@@ -39137,7 +39531,7 @@
         </w:rPr>
         <w:t>Projeto Final (PBL Integrado)</w:t>
       </w:r>
-      <w:bookmarkEnd w:id="71"/>
+      <w:bookmarkEnd w:id="72"/>
     </w:p>
     <w:tbl>
       <w:tblPr>
@@ -39192,14 +39586,14 @@
                 <w:rFonts w:eastAsia="Calibri"/>
                 <w:sz w:val="22"/>
               </w:rPr>
-              <w:t>Juntar as estruturas num simulador de logística, defender as escolhas em 5 a 8 minutos e entregar um RE</w:t>
+              <w:t>Juntar as estruturas num simulador de logística, defender as escolhas em 5 a 8 minutos e entregar um README que o</w:t>
             </w:r>
             <w:r>
               <w:rPr>
                 <w:rFonts w:eastAsia="Calibri"/>
                 <w:sz w:val="22"/>
               </w:rPr>
-              <w:t>ADME que outra pessoa consiga rodar.</w:t>
+              <w:t>utra pessoa consiga rodar.</w:t>
             </w:r>
           </w:p>
         </w:tc>
@@ -39440,7 +39834,7 @@
         <w:spacing w:before="320" w:line="283" w:lineRule="auto"/>
         <w:outlineLvl w:val="1"/>
       </w:pPr>
-      <w:bookmarkStart w:id="72" w:name="s_o_desafio"/>
+      <w:bookmarkStart w:id="73" w:name="s_o_desafio"/>
       <w:r>
         <w:rPr>
           <w:rFonts w:ascii="Trebuchet MS" w:eastAsia="Trebuchet MS" w:hAnsi="Trebuchet MS"/>
@@ -39450,7 +39844,7 @@
         </w:rPr>
         <w:t>O desafio</w:t>
       </w:r>
-      <w:bookmarkEnd w:id="72"/>
+      <w:bookmarkEnd w:id="73"/>
     </w:p>
     <w:p>
       <w:r>
@@ -39473,7 +39867,7 @@
           <wp:inline distT="0" distB="0" distL="0" distR="0">
             <wp:extent cx="5472000" cy="2188800"/>
             <wp:effectExtent l="0" t="0" r="0" b="0"/>
-            <wp:docPr id="24" name="Picture 24"/>
+            <wp:docPr id="28" name="Picture 28"/>
             <wp:cNvGraphicFramePr>
               <a:graphicFrameLocks xmlns:a="http://schemas.openxmlformats.org/drawingml/2006/main" noChangeAspect="1"/>
             </wp:cNvGraphicFramePr>
@@ -39485,7 +39879,7 @@
                     <pic:cNvPicPr/>
                   </pic:nvPicPr>
                   <pic:blipFill>
-                    <a:blip r:embed="rId31"/>
+                    <a:blip r:embed="rId35"/>
                     <a:stretch>
                       <a:fillRect/>
                     </a:stretch>
@@ -40294,15 +40688,15 @@
                 <w:color w:val="D6DEE4"/>
                 <w:sz w:val="20"/>
               </w:rPr>
-              <w:t xml:space="preserve">            u</w:t>
-            </w:r>
-            <w:r>
-              <w:rPr>
-                <w:rFonts w:ascii="Consolas" w:eastAsia="Consolas" w:hAnsi="Consolas"/>
-                <w:color w:val="D6DEE4"/>
-                <w:sz w:val="20"/>
-              </w:rPr>
-              <w:t xml:space="preserve">rgencia, _, id_pacote = </w:t>
+              <w:t xml:space="preserve">            </w:t>
+            </w:r>
+            <w:r>
+              <w:rPr>
+                <w:rFonts w:ascii="Consolas" w:eastAsia="Consolas" w:hAnsi="Consolas"/>
+                <w:color w:val="D6DEE4"/>
+                <w:sz w:val="20"/>
+              </w:rPr>
+              <w:t xml:space="preserve">urgencia, _, id_pacote = </w:t>
             </w:r>
             <w:r>
               <w:rPr>
@@ -40476,7 +40870,7 @@
                 <w:color w:val="7A8B99"/>
                 <w:sz w:val="20"/>
               </w:rPr>
-              <w:t xml:space="preserve"># Monte um exemplo </w:t>
+              <w:t># Monte um exemplo</w:t>
             </w:r>
             <w:r>
               <w:rPr>
@@ -40484,7 +40878,7 @@
                 <w:color w:val="7A8B99"/>
                 <w:sz w:val="20"/>
               </w:rPr>
-              <w:t>pequeno: 4 bairros, 3 pacotes, e rode processar_entregas.</w:t>
+              <w:t xml:space="preserve"> pequeno: 4 bairros, 3 pacotes, e rode processar_entregas.</w:t>
             </w:r>
           </w:p>
         </w:tc>
@@ -40496,7 +40890,7 @@
         <w:spacing w:before="320" w:line="283" w:lineRule="auto"/>
         <w:outlineLvl w:val="1"/>
       </w:pPr>
-      <w:bookmarkStart w:id="73" w:name="s_o_que_a_avaliacao_cobra"/>
+      <w:bookmarkStart w:id="74" w:name="s_o_que_a_avaliacao_cobra"/>
       <w:r>
         <w:rPr>
           <w:rFonts w:ascii="Trebuchet MS" w:eastAsia="Trebuchet MS" w:hAnsi="Trebuchet MS"/>
@@ -40505,149 +40899,6 @@
           <w:sz w:val="30"/>
         </w:rPr>
         <w:t>O que a avaliação cobra</w:t>
-      </w:r>
-      <w:bookmarkEnd w:id="73"/>
-    </w:p>
-    <w:p>
-      <w:pPr>
-        <w:spacing w:after="100" w:line="283" w:lineRule="auto"/>
-        <w:ind w:left="397" w:hanging="198"/>
-      </w:pPr>
-      <w:r>
-        <w:rPr>
-          <w:rFonts w:eastAsia="Calibri"/>
-          <w:b/>
-          <w:color w:val="C46B3A"/>
-          <w:sz w:val="20"/>
-        </w:rPr>
-        <w:t>▸</w:t>
-      </w:r>
-      <w:r>
-        <w:rPr>
-          <w:rFonts w:eastAsia="Calibri"/>
-          <w:b/>
-          <w:color w:val="C46B3A"/>
-          <w:sz w:val="20"/>
-        </w:rPr>
-        <w:t xml:space="preserve">  </w:t>
-      </w:r>
-      <w:r>
-        <w:rPr>
-          <w:rFonts w:eastAsia="Calibri"/>
-        </w:rPr>
-        <w:t>Por que hash para o pacote e não uma BST (ou o contrário, se fizer sentido).</w:t>
-      </w:r>
-    </w:p>
-    <w:p>
-      <w:pPr>
-        <w:spacing w:after="100" w:line="283" w:lineRule="auto"/>
-        <w:ind w:left="397" w:hanging="198"/>
-      </w:pPr>
-      <w:r>
-        <w:rPr>
-          <w:rFonts w:eastAsia="Calibri"/>
-          <w:b/>
-          <w:color w:val="C46B3A"/>
-          <w:sz w:val="20"/>
-        </w:rPr>
-        <w:t>▸</w:t>
-      </w:r>
-      <w:r>
-        <w:rPr>
-          <w:rFonts w:eastAsia="Calibri"/>
-          <w:b/>
-          <w:color w:val="C46B3A"/>
-          <w:sz w:val="20"/>
-        </w:rPr>
-        <w:t xml:space="preserve">  </w:t>
-      </w:r>
-      <w:r>
-        <w:rPr>
-          <w:rFonts w:eastAsia="Calibri"/>
-        </w:rPr>
-        <w:t>Por que grafo no mapa — e não uma lista de endereços soltos.</w:t>
-      </w:r>
-    </w:p>
-    <w:p>
-      <w:pPr>
-        <w:spacing w:after="100" w:line="283" w:lineRule="auto"/>
-        <w:ind w:left="397" w:hanging="198"/>
-      </w:pPr>
-      <w:r>
-        <w:rPr>
-          <w:rFonts w:eastAsia="Calibri"/>
-          <w:b/>
-          <w:color w:val="C46B3A"/>
-          <w:sz w:val="20"/>
-        </w:rPr>
-        <w:t>▸</w:t>
-      </w:r>
-      <w:r>
-        <w:rPr>
-          <w:rFonts w:eastAsia="Calibri"/>
-          <w:b/>
-          <w:color w:val="C46B3A"/>
-          <w:sz w:val="20"/>
-        </w:rPr>
-        <w:t xml:space="preserve">  </w:t>
-      </w:r>
-      <w:r>
-        <w:rPr>
-          <w:rFonts w:eastAsia="Calibri"/>
-        </w:rPr>
-        <w:t xml:space="preserve">Por que heap na urgência </w:t>
-      </w:r>
-      <w:r>
-        <w:rPr>
-          <w:rFonts w:eastAsia="Calibri"/>
-        </w:rPr>
-        <w:t>— e não a fila FIFO da Aula 3.</w:t>
-      </w:r>
-    </w:p>
-    <w:p>
-      <w:pPr>
-        <w:spacing w:after="100" w:line="283" w:lineRule="auto"/>
-        <w:ind w:left="397" w:hanging="198"/>
-      </w:pPr>
-      <w:r>
-        <w:rPr>
-          <w:rFonts w:eastAsia="Calibri"/>
-          <w:b/>
-          <w:color w:val="C46B3A"/>
-          <w:sz w:val="20"/>
-        </w:rPr>
-        <w:t>▸</w:t>
-      </w:r>
-      <w:r>
-        <w:rPr>
-          <w:rFonts w:eastAsia="Calibri"/>
-          <w:b/>
-          <w:color w:val="C46B3A"/>
-          <w:sz w:val="20"/>
-        </w:rPr>
-        <w:t xml:space="preserve">  </w:t>
-      </w:r>
-      <w:r>
-        <w:rPr>
-          <w:rFonts w:eastAsia="Calibri"/>
-        </w:rPr>
-        <w:t>Um limite que você conhece: BST degenerada, colisão de hash, heap só no array.</w:t>
-      </w:r>
-    </w:p>
-    <w:p>
-      <w:pPr>
-        <w:spacing w:before="320" w:line="283" w:lineRule="auto"/>
-        <w:outlineLvl w:val="1"/>
-      </w:pPr>
-      <w:bookmarkStart w:id="74" w:name="s_roteiro_da_apresentacao_5_a_8_minutos"/>
-      <w:r>
-        <w:rPr>
-          <w:rFonts w:ascii="Trebuchet MS" w:eastAsia="Trebuchet MS" w:hAnsi="Trebuchet MS"/>
-          <w:b/>
-          <w:color w:val="1A6B64"/>
-          <w:sz w:val="30"/>
-        </w:rPr>
-        <w:t>Roteiro da apresentação (5 a 8 minutos)</w:t>
       </w:r>
       <w:bookmarkEnd w:id="74"/>
     </w:p>
@@ -40678,7 +40929,7 @@
         <w:rPr>
           <w:rFonts w:eastAsia="Calibri"/>
         </w:rPr>
-        <w:t>1. Qual o problema? (pacotes com urgência + mapa da cidade).</w:t>
+        <w:t>Por que hash para o pacote e não uma BST (ou o contrário, se fizer sentido).</w:t>
       </w:r>
     </w:p>
     <w:p>
@@ -40708,13 +40959,7 @@
         <w:rPr>
           <w:rFonts w:eastAsia="Calibri"/>
         </w:rPr>
-        <w:t>2. Rodar o cadastro de rotas e de pa</w:t>
-      </w:r>
-      <w:r>
-        <w:rPr>
-          <w:rFonts w:eastAsia="Calibri"/>
-        </w:rPr>
-        <w:t>cotes.</w:t>
+        <w:t>Por que grafo no mapa — e não uma lista de endereços soltos.</w:t>
       </w:r>
     </w:p>
     <w:p>
@@ -40744,7 +40989,13 @@
         <w:rPr>
           <w:rFonts w:eastAsia="Calibri"/>
         </w:rPr>
-        <w:t>3. Processar entregas: o crítico sai primeiro; o caminho aparece.</w:t>
+        <w:t>Por que heap na urgência</w:t>
+      </w:r>
+      <w:r>
+        <w:rPr>
+          <w:rFonts w:eastAsia="Calibri"/>
+        </w:rPr>
+        <w:t xml:space="preserve"> — e não a fila FIFO da Aula 3.</w:t>
       </w:r>
     </w:p>
     <w:p>
@@ -40774,8 +41025,25 @@
         <w:rPr>
           <w:rFonts w:eastAsia="Calibri"/>
         </w:rPr>
-        <w:t>4. No código: apontar hash, grafo/BFS e heap.</w:t>
-      </w:r>
+        <w:t>Um limite que você conhece: BST degenerada, colisão de hash, heap só no array.</w:t>
+      </w:r>
+    </w:p>
+    <w:p>
+      <w:pPr>
+        <w:spacing w:before="320" w:line="283" w:lineRule="auto"/>
+        <w:outlineLvl w:val="1"/>
+      </w:pPr>
+      <w:bookmarkStart w:id="75" w:name="s_roteiro_da_apresentacao_5_a_8_minutos"/>
+      <w:r>
+        <w:rPr>
+          <w:rFonts w:ascii="Trebuchet MS" w:eastAsia="Trebuchet MS" w:hAnsi="Trebuchet MS"/>
+          <w:b/>
+          <w:color w:val="1A6B64"/>
+          <w:sz w:val="30"/>
+        </w:rPr>
+        <w:t>Roteiro da apresentação (5 a 8 minutos)</w:t>
+      </w:r>
+      <w:bookmarkEnd w:id="75"/>
     </w:p>
     <w:p>
       <w:pPr>
@@ -40804,6 +41072,132 @@
         <w:rPr>
           <w:rFonts w:eastAsia="Calibri"/>
         </w:rPr>
+        <w:t>1. Qual o problema? (pacotes com urgência + mapa da cidade).</w:t>
+      </w:r>
+    </w:p>
+    <w:p>
+      <w:pPr>
+        <w:spacing w:after="100" w:line="283" w:lineRule="auto"/>
+        <w:ind w:left="397" w:hanging="198"/>
+      </w:pPr>
+      <w:r>
+        <w:rPr>
+          <w:rFonts w:eastAsia="Calibri"/>
+          <w:b/>
+          <w:color w:val="C46B3A"/>
+          <w:sz w:val="20"/>
+        </w:rPr>
+        <w:t>▸</w:t>
+      </w:r>
+      <w:r>
+        <w:rPr>
+          <w:rFonts w:eastAsia="Calibri"/>
+          <w:b/>
+          <w:color w:val="C46B3A"/>
+          <w:sz w:val="20"/>
+        </w:rPr>
+        <w:t xml:space="preserve">  </w:t>
+      </w:r>
+      <w:r>
+        <w:rPr>
+          <w:rFonts w:eastAsia="Calibri"/>
+        </w:rPr>
+        <w:t>2. Rodar o cadastro de rotas e de p</w:t>
+      </w:r>
+      <w:r>
+        <w:rPr>
+          <w:rFonts w:eastAsia="Calibri"/>
+        </w:rPr>
+        <w:t>acotes.</w:t>
+      </w:r>
+    </w:p>
+    <w:p>
+      <w:pPr>
+        <w:spacing w:after="100" w:line="283" w:lineRule="auto"/>
+        <w:ind w:left="397" w:hanging="198"/>
+      </w:pPr>
+      <w:r>
+        <w:rPr>
+          <w:rFonts w:eastAsia="Calibri"/>
+          <w:b/>
+          <w:color w:val="C46B3A"/>
+          <w:sz w:val="20"/>
+        </w:rPr>
+        <w:t>▸</w:t>
+      </w:r>
+      <w:r>
+        <w:rPr>
+          <w:rFonts w:eastAsia="Calibri"/>
+          <w:b/>
+          <w:color w:val="C46B3A"/>
+          <w:sz w:val="20"/>
+        </w:rPr>
+        <w:t xml:space="preserve">  </w:t>
+      </w:r>
+      <w:r>
+        <w:rPr>
+          <w:rFonts w:eastAsia="Calibri"/>
+        </w:rPr>
+        <w:t>3. Processar entregas: o crítico sai primeiro; o caminho aparece.</w:t>
+      </w:r>
+    </w:p>
+    <w:p>
+      <w:pPr>
+        <w:spacing w:after="100" w:line="283" w:lineRule="auto"/>
+        <w:ind w:left="397" w:hanging="198"/>
+      </w:pPr>
+      <w:r>
+        <w:rPr>
+          <w:rFonts w:eastAsia="Calibri"/>
+          <w:b/>
+          <w:color w:val="C46B3A"/>
+          <w:sz w:val="20"/>
+        </w:rPr>
+        <w:t>▸</w:t>
+      </w:r>
+      <w:r>
+        <w:rPr>
+          <w:rFonts w:eastAsia="Calibri"/>
+          <w:b/>
+          <w:color w:val="C46B3A"/>
+          <w:sz w:val="20"/>
+        </w:rPr>
+        <w:t xml:space="preserve">  </w:t>
+      </w:r>
+      <w:r>
+        <w:rPr>
+          <w:rFonts w:eastAsia="Calibri"/>
+        </w:rPr>
+        <w:t>4. No código: apontar hash, grafo/BFS e heap.</w:t>
+      </w:r>
+    </w:p>
+    <w:p>
+      <w:pPr>
+        <w:spacing w:after="100" w:line="283" w:lineRule="auto"/>
+        <w:ind w:left="397" w:hanging="198"/>
+      </w:pPr>
+      <w:r>
+        <w:rPr>
+          <w:rFonts w:eastAsia="Calibri"/>
+          <w:b/>
+          <w:color w:val="C46B3A"/>
+          <w:sz w:val="20"/>
+        </w:rPr>
+        <w:t>▸</w:t>
+      </w:r>
+      <w:r>
+        <w:rPr>
+          <w:rFonts w:eastAsia="Calibri"/>
+          <w:b/>
+          <w:color w:val="C46B3A"/>
+          <w:sz w:val="20"/>
+        </w:rPr>
+        <w:t xml:space="preserve">  </w:t>
+      </w:r>
+      <w:r>
+        <w:rPr>
+          <w:rFonts w:eastAsia="Calibri"/>
+        </w:rPr>
         <w:t>5. Uma frase do que você não fez de propósito (GPS real, banco, interface web).</w:t>
       </w:r>
     </w:p>
@@ -40812,7 +41206,7 @@
         <w:spacing w:before="320" w:line="283" w:lineRule="auto"/>
         <w:outlineLvl w:val="1"/>
       </w:pPr>
-      <w:bookmarkStart w:id="75" w:name="s_readme_entregue_junto"/>
+      <w:bookmarkStart w:id="76" w:name="s_readme_entregue_junto"/>
       <w:r>
         <w:rPr>
           <w:rFonts w:ascii="Trebuchet MS" w:eastAsia="Trebuchet MS" w:hAnsi="Trebuchet MS"/>
@@ -40822,7 +41216,7 @@
         </w:rPr>
         <w:t>README (entregue junto)</w:t>
       </w:r>
-      <w:bookmarkEnd w:id="75"/>
+      <w:bookmarkEnd w:id="76"/>
     </w:p>
     <w:p>
       <w:pPr>
@@ -40878,7 +41272,7 @@
                 <w:color w:val="7A8B99"/>
                 <w:sz w:val="20"/>
               </w:rPr>
-              <w:t># Simulador de</w:t>
+              <w:t># Simulador d</w:t>
             </w:r>
             <w:r>
               <w:rPr>
@@ -40886,7 +41280,7 @@
                 <w:color w:val="7A8B99"/>
                 <w:sz w:val="20"/>
               </w:rPr>
-              <w:t xml:space="preserve"> logística</w:t>
+              <w:t>e logística</w:t>
             </w:r>
           </w:p>
           <w:p>
@@ -41036,15 +41430,7 @@
                 <w:color w:val="D6DEE4"/>
                 <w:sz w:val="20"/>
               </w:rPr>
-              <w:t>Como</w:t>
-            </w:r>
-            <w:r>
-              <w:rPr>
-                <w:rFonts w:ascii="Consolas" w:eastAsia="Consolas" w:hAnsi="Consolas"/>
-                <w:color w:val="D6DEE4"/>
-                <w:sz w:val="20"/>
-              </w:rPr>
-              <w:t xml:space="preserve"> rodar:</w:t>
+              <w:t>Como rodar:</w:t>
             </w:r>
           </w:p>
           <w:p>
@@ -41069,7 +41455,7 @@
         <w:spacing w:before="320" w:line="283" w:lineRule="auto"/>
         <w:outlineLvl w:val="1"/>
       </w:pPr>
-      <w:bookmarkStart w:id="76" w:name="s_checklist_antes_de_apresentar"/>
+      <w:bookmarkStart w:id="77" w:name="s_checklist_antes_de_apresentar"/>
       <w:r>
         <w:rPr>
           <w:rFonts w:ascii="Trebuchet MS" w:eastAsia="Trebuchet MS" w:hAnsi="Trebuchet MS"/>
@@ -41079,7 +41465,7 @@
         </w:rPr>
         <w:t>Checklist antes de apresentar</w:t>
       </w:r>
-      <w:bookmarkEnd w:id="76"/>
+      <w:bookmarkEnd w:id="77"/>
     </w:p>
     <w:tbl>
       <w:tblPr>
@@ -41198,13 +41584,13 @@
         <w:rPr>
           <w:rFonts w:eastAsia="Calibri"/>
         </w:rPr>
-        <w:t xml:space="preserve">[ ] BFS devolve um </w:t>
-      </w:r>
-      <w:r>
-        <w:rPr>
-          <w:rFonts w:eastAsia="Calibri"/>
-        </w:rPr>
-        <w:t>caminho que existe no grafo (teste com o desenho).</w:t>
+        <w:t xml:space="preserve">[ ] BFS devolve </w:t>
+      </w:r>
+      <w:r>
+        <w:rPr>
+          <w:rFonts w:eastAsia="Calibri"/>
+        </w:rPr>
+        <w:t>um caminho que existe no grafo (teste com o desenho).</w:t>
       </w:r>
     </w:p>
     <w:p>
@@ -41339,7 +41725,7 @@
         <w:spacing w:after="240" w:line="283" w:lineRule="auto"/>
         <w:outlineLvl w:val="0"/>
       </w:pPr>
-      <w:bookmarkStart w:id="77" w:name="s_apendice_codigo_de_referencia"/>
+      <w:bookmarkStart w:id="78" w:name="s_apendice_codigo_de_referencia"/>
       <w:r>
         <w:rPr>
           <w:rFonts w:ascii="Trebuchet MS" w:eastAsia="Trebuchet MS" w:hAnsi="Trebuchet MS"/>
@@ -41349,7 +41735,7 @@
         </w:rPr>
         <w:t>Código de referência</w:t>
       </w:r>
-      <w:bookmarkEnd w:id="77"/>
+      <w:bookmarkEnd w:id="78"/>
     </w:p>
     <w:p>
       <w:r>
@@ -41894,7 +42280,7 @@
         <w:spacing w:before="320" w:line="283" w:lineRule="auto"/>
         <w:outlineLvl w:val="1"/>
       </w:pPr>
-      <w:bookmarkStart w:id="78" w:name="s_gabarito_aula_4_hash"/>
+      <w:bookmarkStart w:id="79" w:name="s_gabarito_aula_4_hash"/>
       <w:r>
         <w:rPr>
           <w:rFonts w:ascii="Trebuchet MS" w:eastAsia="Trebuchet MS" w:hAnsi="Trebuchet MS"/>
@@ -41904,7 +42290,7 @@
         </w:rPr>
         <w:t>Gabarito — Aula 4 (hash)</w:t>
       </w:r>
-      <w:bookmarkEnd w:id="78"/>
+      <w:bookmarkEnd w:id="79"/>
     </w:p>
     <w:tbl>
       <w:tblPr>
@@ -43548,7 +43934,7 @@
         <w:spacing w:after="240" w:line="283" w:lineRule="auto"/>
         <w:outlineLvl w:val="0"/>
       </w:pPr>
-      <w:bookmarkStart w:id="79" w:name="s_apendice_glossario_de_funcoes"/>
+      <w:bookmarkStart w:id="80" w:name="s_apendice_glossario_de_funcoes"/>
       <w:r>
         <w:rPr>
           <w:rFonts w:ascii="Trebuchet MS" w:eastAsia="Trebuchet MS" w:hAnsi="Trebuchet MS"/>
@@ -43558,7 +43944,7 @@
         </w:rPr>
         <w:t>Glossário de funções</w:t>
       </w:r>
-      <w:bookmarkEnd w:id="79"/>
+      <w:bookmarkEnd w:id="80"/>
     </w:p>
     <w:p>
       <w:r>
@@ -43663,7 +44049,7 @@
         <w:spacing w:before="320" w:line="283" w:lineRule="auto"/>
         <w:outlineLvl w:val="1"/>
       </w:pPr>
-      <w:bookmarkStart w:id="80" w:name="s_indice_rapido"/>
+      <w:bookmarkStart w:id="81" w:name="s_indice_rapido"/>
       <w:r>
         <w:rPr>
           <w:rFonts w:ascii="Trebuchet MS" w:eastAsia="Trebuchet MS" w:hAnsi="Trebuchet MS"/>
@@ -43673,7 +44059,7 @@
         </w:rPr>
         <w:t>Índice rápido</w:t>
       </w:r>
-      <w:bookmarkEnd w:id="80"/>
+      <w:bookmarkEnd w:id="81"/>
     </w:p>
     <w:p>
       <w:pPr>
@@ -43725,7 +44111,7 @@
         <w:rPr>
           <w:noProof/>
         </w:rPr>
-        <w:t>52</w:t>
+        <w:t>53</w:t>
       </w:r>
       <w:r>
         <w:fldChar w:fldCharType="end"/>
@@ -43781,7 +44167,7 @@
         <w:rPr>
           <w:noProof/>
         </w:rPr>
-        <w:t>52</w:t>
+        <w:t>53</w:t>
       </w:r>
       <w:r>
         <w:fldChar w:fldCharType="end"/>
@@ -43840,7 +44226,7 @@
         <w:rPr>
           <w:noProof/>
         </w:rPr>
-        <w:t>53</w:t>
+        <w:t>54</w:t>
       </w:r>
       <w:r>
         <w:fldChar w:fldCharType="end"/>
@@ -43896,7 +44282,7 @@
         <w:rPr>
           <w:noProof/>
         </w:rPr>
-        <w:t>53</w:t>
+        <w:t>54</w:t>
       </w:r>
       <w:r>
         <w:fldChar w:fldCharType="end"/>
@@ -43952,7 +44338,7 @@
         <w:rPr>
           <w:noProof/>
         </w:rPr>
-        <w:t>53</w:t>
+        <w:t>54</w:t>
       </w:r>
       <w:r>
         <w:fldChar w:fldCharType="end"/>
@@ -44008,7 +44394,7 @@
         <w:rPr>
           <w:noProof/>
         </w:rPr>
-        <w:t>53</w:t>
+        <w:t>54</w:t>
       </w:r>
       <w:r>
         <w:fldChar w:fldCharType="end"/>
@@ -44064,7 +44450,7 @@
         <w:rPr>
           <w:noProof/>
         </w:rPr>
-        <w:t>53</w:t>
+        <w:t>54</w:t>
       </w:r>
       <w:r>
         <w:fldChar w:fldCharType="end"/>
@@ -44120,7 +44506,7 @@
         <w:rPr>
           <w:noProof/>
         </w:rPr>
-        <w:t>53</w:t>
+        <w:t>54</w:t>
       </w:r>
       <w:r>
         <w:fldChar w:fldCharType="end"/>
@@ -44176,7 +44562,7 @@
         <w:rPr>
           <w:noProof/>
         </w:rPr>
-        <w:t>54</w:t>
+        <w:t>55</w:t>
       </w:r>
       <w:r>
         <w:fldChar w:fldCharType="end"/>
@@ -44232,7 +44618,7 @@
         <w:rPr>
           <w:noProof/>
         </w:rPr>
-        <w:t>54</w:t>
+        <w:t>55</w:t>
       </w:r>
       <w:r>
         <w:fldChar w:fldCharType="end"/>
@@ -44288,7 +44674,7 @@
         <w:rPr>
           <w:noProof/>
         </w:rPr>
-        <w:t>54</w:t>
+        <w:t>55</w:t>
       </w:r>
       <w:r>
         <w:fldChar w:fldCharType="end"/>
@@ -44298,7 +44684,7 @@
       <w:pPr>
         <w:spacing w:before="240" w:after="120" w:line="283" w:lineRule="auto"/>
       </w:pPr>
-      <w:bookmarkStart w:id="81" w:name="glossario_s_ord"/>
+      <w:bookmarkStart w:id="82" w:name="glossario_s_ord"/>
       <w:r>
         <w:rPr>
           <w:rFonts w:ascii="Trebuchet MS" w:eastAsia="Trebuchet MS" w:hAnsi="Trebuchet MS"/>
@@ -44307,7 +44693,7 @@
         </w:rPr>
         <w:t>ord()</w:t>
       </w:r>
-      <w:bookmarkEnd w:id="81"/>
+      <w:bookmarkEnd w:id="82"/>
     </w:p>
     <w:p>
       <w:r>
@@ -44503,7 +44889,7 @@
       <w:pPr>
         <w:spacing w:before="240" w:after="120" w:line="283" w:lineRule="auto"/>
       </w:pPr>
-      <w:bookmarkStart w:id="82" w:name="glossario_s_sum"/>
+      <w:bookmarkStart w:id="83" w:name="glossario_s_sum"/>
       <w:r>
         <w:rPr>
           <w:rFonts w:ascii="Trebuchet MS" w:eastAsia="Trebuchet MS" w:hAnsi="Trebuchet MS"/>
@@ -44512,7 +44898,7 @@
         </w:rPr>
         <w:t>sum()</w:t>
       </w:r>
-      <w:bookmarkEnd w:id="82"/>
+      <w:bookmarkEnd w:id="83"/>
     </w:p>
     <w:p>
       <w:r>
@@ -44783,7 +45169,7 @@
       <w:pPr>
         <w:spacing w:before="240" w:after="120" w:line="283" w:lineRule="auto"/>
       </w:pPr>
-      <w:bookmarkStart w:id="83" w:name="glossario_s_str"/>
+      <w:bookmarkStart w:id="84" w:name="glossario_s_str"/>
       <w:r>
         <w:rPr>
           <w:rFonts w:ascii="Trebuchet MS" w:eastAsia="Trebuchet MS" w:hAnsi="Trebuchet MS"/>
@@ -44793,7 +45179,7 @@
         <w:lastRenderedPageBreak/>
         <w:t>str()</w:t>
       </w:r>
-      <w:bookmarkEnd w:id="83"/>
+      <w:bookmarkEnd w:id="84"/>
     </w:p>
     <w:p>
       <w:r>
@@ -45011,7 +45397,7 @@
       <w:pPr>
         <w:spacing w:before="240" w:after="120" w:line="283" w:lineRule="auto"/>
       </w:pPr>
-      <w:bookmarkStart w:id="84" w:name="glossario_s_len"/>
+      <w:bookmarkStart w:id="85" w:name="glossario_s_len"/>
       <w:r>
         <w:rPr>
           <w:rFonts w:ascii="Trebuchet MS" w:eastAsia="Trebuchet MS" w:hAnsi="Trebuchet MS"/>
@@ -45020,7 +45406,7 @@
         </w:rPr>
         <w:t>len()</w:t>
       </w:r>
-      <w:bookmarkEnd w:id="84"/>
+      <w:bookmarkEnd w:id="85"/>
     </w:p>
     <w:p>
       <w:r>
@@ -45234,7 +45620,7 @@
       <w:pPr>
         <w:spacing w:before="240" w:after="120" w:line="283" w:lineRule="auto"/>
       </w:pPr>
-      <w:bookmarkStart w:id="85" w:name="glossario_s_append"/>
+      <w:bookmarkStart w:id="86" w:name="glossario_s_append"/>
       <w:r>
         <w:rPr>
           <w:rFonts w:ascii="Trebuchet MS" w:eastAsia="Trebuchet MS" w:hAnsi="Trebuchet MS"/>
@@ -45243,7 +45629,7 @@
         </w:rPr>
         <w:t>append()</w:t>
       </w:r>
-      <w:bookmarkEnd w:id="85"/>
+      <w:bookmarkEnd w:id="86"/>
     </w:p>
     <w:p>
       <w:r>
@@ -45441,7 +45827,7 @@
       <w:pPr>
         <w:spacing w:before="240" w:after="120" w:line="283" w:lineRule="auto"/>
       </w:pPr>
-      <w:bookmarkStart w:id="86" w:name="glossario_s_pop"/>
+      <w:bookmarkStart w:id="87" w:name="glossario_s_pop"/>
       <w:r>
         <w:rPr>
           <w:rFonts w:ascii="Trebuchet MS" w:eastAsia="Trebuchet MS" w:hAnsi="Trebuchet MS"/>
@@ -45450,7 +45836,7 @@
         </w:rPr>
         <w:t>pop()</w:t>
       </w:r>
-      <w:bookmarkEnd w:id="86"/>
+      <w:bookmarkEnd w:id="87"/>
     </w:p>
     <w:p>
       <w:r>
@@ -45734,7 +46120,7 @@
       <w:pPr>
         <w:spacing w:before="240" w:after="120" w:line="283" w:lineRule="auto"/>
       </w:pPr>
-      <w:bookmarkStart w:id="87" w:name="glossario_s_deque"/>
+      <w:bookmarkStart w:id="88" w:name="glossario_s_deque"/>
       <w:r>
         <w:rPr>
           <w:rFonts w:ascii="Trebuchet MS" w:eastAsia="Trebuchet MS" w:hAnsi="Trebuchet MS"/>
@@ -45743,7 +46129,7 @@
         </w:rPr>
         <w:t>deque</w:t>
       </w:r>
-      <w:bookmarkEnd w:id="87"/>
+      <w:bookmarkEnd w:id="88"/>
     </w:p>
     <w:p>
       <w:r>
@@ -45995,7 +46381,7 @@
       <w:pPr>
         <w:spacing w:before="240" w:after="120" w:line="283" w:lineRule="auto"/>
       </w:pPr>
-      <w:bookmarkStart w:id="88" w:name="glossario_s_appendleft"/>
+      <w:bookmarkStart w:id="89" w:name="glossario_s_appendleft"/>
       <w:r>
         <w:rPr>
           <w:rFonts w:ascii="Trebuchet MS" w:eastAsia="Trebuchet MS" w:hAnsi="Trebuchet MS"/>
@@ -46004,7 +46390,7 @@
         </w:rPr>
         <w:t>appendleft()</w:t>
       </w:r>
-      <w:bookmarkEnd w:id="88"/>
+      <w:bookmarkEnd w:id="89"/>
     </w:p>
     <w:p>
       <w:r>
@@ -46259,7 +46645,7 @@
       <w:pPr>
         <w:spacing w:before="240" w:after="120" w:line="283" w:lineRule="auto"/>
       </w:pPr>
-      <w:bookmarkStart w:id="89" w:name="glossario_s_popleft"/>
+      <w:bookmarkStart w:id="90" w:name="glossario_s_popleft"/>
       <w:r>
         <w:rPr>
           <w:rFonts w:ascii="Trebuchet MS" w:eastAsia="Trebuchet MS" w:hAnsi="Trebuchet MS"/>
@@ -46268,7 +46654,7 @@
         </w:rPr>
         <w:t>popleft()</w:t>
       </w:r>
-      <w:bookmarkEnd w:id="89"/>
+      <w:bookmarkEnd w:id="90"/>
     </w:p>
     <w:p>
       <w:r>
@@ -46471,7 +46857,7 @@
       <w:pPr>
         <w:spacing w:before="240" w:after="120" w:line="283" w:lineRule="auto"/>
       </w:pPr>
-      <w:bookmarkStart w:id="90" w:name="glossario_s_setdefault"/>
+      <w:bookmarkStart w:id="91" w:name="glossario_s_setdefault"/>
       <w:r>
         <w:rPr>
           <w:rFonts w:ascii="Trebuchet MS" w:eastAsia="Trebuchet MS" w:hAnsi="Trebuchet MS"/>
@@ -46480,7 +46866,7 @@
         </w:rPr>
         <w:t>setdefault()</w:t>
       </w:r>
-      <w:bookmarkEnd w:id="90"/>
+      <w:bookmarkEnd w:id="91"/>
     </w:p>
     <w:p>
       <w:r>
@@ -46670,7 +47056,7 @@
       <w:pPr>
         <w:spacing w:before="240" w:after="120" w:line="283" w:lineRule="auto"/>
       </w:pPr>
-      <w:bookmarkStart w:id="91" w:name="glossario_s_resto"/>
+      <w:bookmarkStart w:id="92" w:name="glossario_s_resto"/>
       <w:r>
         <w:rPr>
           <w:rFonts w:ascii="Trebuchet MS" w:eastAsia="Trebuchet MS" w:hAnsi="Trebuchet MS"/>
@@ -46679,7 +47065,7 @@
         </w:rPr>
         <w:t>%</w:t>
       </w:r>
-      <w:bookmarkEnd w:id="91"/>
+      <w:bookmarkEnd w:id="92"/>
     </w:p>
     <w:p>
       <w:r>
@@ -47004,12 +47390,12 @@
       </w:r>
     </w:p>
     <w:sectPr>
-      <w:headerReference w:type="even" r:id="rId32"/>
-      <w:headerReference w:type="default" r:id="rId33"/>
-      <w:footerReference w:type="even" r:id="rId34"/>
-      <w:footerReference w:type="default" r:id="rId35"/>
-      <w:headerReference w:type="first" r:id="rId36"/>
-      <w:footerReference w:type="first" r:id="rId37"/>
+      <w:headerReference w:type="even" r:id="rId36"/>
+      <w:headerReference w:type="default" r:id="rId37"/>
+      <w:footerReference w:type="even" r:id="rId38"/>
+      <w:footerReference w:type="default" r:id="rId39"/>
+      <w:headerReference w:type="first" r:id="rId40"/>
+      <w:footerReference w:type="first" r:id="rId41"/>
       <w:pgSz w:w="11906" w:h="16838"/>
       <w:pgMar w:top="1077" w:right="1134" w:bottom="1134" w:left="1134" w:header="720" w:footer="720" w:gutter="0"/>
       <w:cols w:space="720"/>
@@ -59104,7 +59490,7 @@
 </file>
 
 <file path=customXml/itemProps1.xml><?xml version="1.0" encoding="utf-8"?>
-<ds:datastoreItem xmlns:ds="http://schemas.openxmlformats.org/officeDocument/2006/customXml" ds:itemID="{827933C9-1C6C-4D19-9D37-8D449DCD7B3C}">
+<ds:datastoreItem xmlns:ds="http://schemas.openxmlformats.org/officeDocument/2006/customXml" ds:itemID="{62F25793-409E-45CC-9EFE-538975F62714}">
   <ds:schemaRefs>
     <ds:schemaRef ds:uri="http://schemas.openxmlformats.org/officeDocument/2006/bibliography"/>
   </ds:schemaRefs>

</xml_diff>